<commit_message>
Add writing space under each email template
The four templates in chapter 11 were read-only examples. Each now ends
with a 'Now write yours' prompt and seven lines, so they work as
exercises rather than samples. 377 writing lines in total.

Co-Authored-By: Claude Opus 5 <noreply@anthropic.com>
Claude-Session: https://claude.ai/code/session_01TjUUnX46NGL9Rs94eLWYcA
</commit_message>
<xml_diff>
--- a/book/Muslimah-Faceless-Business-Blueprint.docx
+++ b/book/Muslimah-Faceless-Business-Blueprint.docx
@@ -8398,8 +8398,133 @@
         <w:pBdr>
           <w:bottom w:val="single" w:color="E5DFD6" w:sz="4" w:space="6"/>
         </w:pBdr>
-        <w:spacing w:after="130"/>
+        <w:spacing w:after="200"/>
         <w:ind w:left="200"/>
+      </w:pPr>
+      <w:r>
+        <w:rPr>
+          <w:rFonts w:ascii="Lato" w:cs="Lato" w:eastAsia="Lato" w:hAnsi="Lato"/>
+        </w:rPr>
+        <w:t xml:space="preserve"/>
+      </w:r>
+    </w:p>
+    <w:p>
+      <w:pPr>
+        <w:spacing w:after="40" w:before="60"/>
+      </w:pPr>
+      <w:r>
+        <w:rPr>
+          <w:rFonts w:ascii="Lato" w:cs="Lato" w:eastAsia="Lato" w:hAnsi="Lato"/>
+          <w:b/>
+          <w:bCs/>
+          <w:color w:val="102A43"/>
+          <w:sz w:val="20"/>
+          <w:szCs w:val="20"/>
+        </w:rPr>
+        <w:t xml:space="preserve">Now write yours.</w:t>
+      </w:r>
+    </w:p>
+    <w:p>
+      <w:pPr>
+        <w:pBdr>
+          <w:bottom w:val="single" w:color="C9C2B8" w:sz="4" w:space="4"/>
+        </w:pBdr>
+        <w:spacing w:after="0" w:before="170"/>
+      </w:pPr>
+      <w:r>
+        <w:rPr>
+          <w:rFonts w:ascii="Lato" w:cs="Lato" w:eastAsia="Lato" w:hAnsi="Lato"/>
+        </w:rPr>
+        <w:t xml:space="preserve"> </w:t>
+      </w:r>
+    </w:p>
+    <w:p>
+      <w:pPr>
+        <w:pBdr>
+          <w:bottom w:val="single" w:color="C9C2B8" w:sz="4" w:space="4"/>
+        </w:pBdr>
+        <w:spacing w:after="0" w:before="170"/>
+      </w:pPr>
+      <w:r>
+        <w:rPr>
+          <w:rFonts w:ascii="Lato" w:cs="Lato" w:eastAsia="Lato" w:hAnsi="Lato"/>
+        </w:rPr>
+        <w:t xml:space="preserve"> </w:t>
+      </w:r>
+    </w:p>
+    <w:p>
+      <w:pPr>
+        <w:pBdr>
+          <w:bottom w:val="single" w:color="C9C2B8" w:sz="4" w:space="4"/>
+        </w:pBdr>
+        <w:spacing w:after="0" w:before="170"/>
+      </w:pPr>
+      <w:r>
+        <w:rPr>
+          <w:rFonts w:ascii="Lato" w:cs="Lato" w:eastAsia="Lato" w:hAnsi="Lato"/>
+        </w:rPr>
+        <w:t xml:space="preserve"> </w:t>
+      </w:r>
+    </w:p>
+    <w:p>
+      <w:pPr>
+        <w:pBdr>
+          <w:bottom w:val="single" w:color="C9C2B8" w:sz="4" w:space="4"/>
+        </w:pBdr>
+        <w:spacing w:after="0" w:before="170"/>
+      </w:pPr>
+      <w:r>
+        <w:rPr>
+          <w:rFonts w:ascii="Lato" w:cs="Lato" w:eastAsia="Lato" w:hAnsi="Lato"/>
+        </w:rPr>
+        <w:t xml:space="preserve"> </w:t>
+      </w:r>
+    </w:p>
+    <w:p>
+      <w:pPr>
+        <w:pBdr>
+          <w:bottom w:val="single" w:color="C9C2B8" w:sz="4" w:space="4"/>
+        </w:pBdr>
+        <w:spacing w:after="0" w:before="170"/>
+      </w:pPr>
+      <w:r>
+        <w:rPr>
+          <w:rFonts w:ascii="Lato" w:cs="Lato" w:eastAsia="Lato" w:hAnsi="Lato"/>
+        </w:rPr>
+        <w:t xml:space="preserve"> </w:t>
+      </w:r>
+    </w:p>
+    <w:p>
+      <w:pPr>
+        <w:pBdr>
+          <w:bottom w:val="single" w:color="C9C2B8" w:sz="4" w:space="4"/>
+        </w:pBdr>
+        <w:spacing w:after="0" w:before="170"/>
+      </w:pPr>
+      <w:r>
+        <w:rPr>
+          <w:rFonts w:ascii="Lato" w:cs="Lato" w:eastAsia="Lato" w:hAnsi="Lato"/>
+        </w:rPr>
+        <w:t xml:space="preserve"> </w:t>
+      </w:r>
+    </w:p>
+    <w:p>
+      <w:pPr>
+        <w:pBdr>
+          <w:bottom w:val="single" w:color="C9C2B8" w:sz="4" w:space="4"/>
+        </w:pBdr>
+        <w:spacing w:after="0" w:before="170"/>
+      </w:pPr>
+      <w:r>
+        <w:rPr>
+          <w:rFonts w:ascii="Lato" w:cs="Lato" w:eastAsia="Lato" w:hAnsi="Lato"/>
+        </w:rPr>
+        <w:t xml:space="preserve"> </w:t>
+      </w:r>
+    </w:p>
+    <w:p>
+      <w:pPr>
+        <w:spacing w:after="260"/>
       </w:pPr>
       <w:r>
         <w:rPr>
@@ -8553,8 +8678,133 @@
         <w:pBdr>
           <w:bottom w:val="single" w:color="E5DFD6" w:sz="4" w:space="6"/>
         </w:pBdr>
-        <w:spacing w:after="130"/>
+        <w:spacing w:after="200"/>
         <w:ind w:left="200"/>
+      </w:pPr>
+      <w:r>
+        <w:rPr>
+          <w:rFonts w:ascii="Lato" w:cs="Lato" w:eastAsia="Lato" w:hAnsi="Lato"/>
+        </w:rPr>
+        <w:t xml:space="preserve"/>
+      </w:r>
+    </w:p>
+    <w:p>
+      <w:pPr>
+        <w:spacing w:after="40" w:before="60"/>
+      </w:pPr>
+      <w:r>
+        <w:rPr>
+          <w:rFonts w:ascii="Lato" w:cs="Lato" w:eastAsia="Lato" w:hAnsi="Lato"/>
+          <w:b/>
+          <w:bCs/>
+          <w:color w:val="102A43"/>
+          <w:sz w:val="20"/>
+          <w:szCs w:val="20"/>
+        </w:rPr>
+        <w:t xml:space="preserve">Now write yours.</w:t>
+      </w:r>
+    </w:p>
+    <w:p>
+      <w:pPr>
+        <w:pBdr>
+          <w:bottom w:val="single" w:color="C9C2B8" w:sz="4" w:space="4"/>
+        </w:pBdr>
+        <w:spacing w:after="0" w:before="170"/>
+      </w:pPr>
+      <w:r>
+        <w:rPr>
+          <w:rFonts w:ascii="Lato" w:cs="Lato" w:eastAsia="Lato" w:hAnsi="Lato"/>
+        </w:rPr>
+        <w:t xml:space="preserve"> </w:t>
+      </w:r>
+    </w:p>
+    <w:p>
+      <w:pPr>
+        <w:pBdr>
+          <w:bottom w:val="single" w:color="C9C2B8" w:sz="4" w:space="4"/>
+        </w:pBdr>
+        <w:spacing w:after="0" w:before="170"/>
+      </w:pPr>
+      <w:r>
+        <w:rPr>
+          <w:rFonts w:ascii="Lato" w:cs="Lato" w:eastAsia="Lato" w:hAnsi="Lato"/>
+        </w:rPr>
+        <w:t xml:space="preserve"> </w:t>
+      </w:r>
+    </w:p>
+    <w:p>
+      <w:pPr>
+        <w:pBdr>
+          <w:bottom w:val="single" w:color="C9C2B8" w:sz="4" w:space="4"/>
+        </w:pBdr>
+        <w:spacing w:after="0" w:before="170"/>
+      </w:pPr>
+      <w:r>
+        <w:rPr>
+          <w:rFonts w:ascii="Lato" w:cs="Lato" w:eastAsia="Lato" w:hAnsi="Lato"/>
+        </w:rPr>
+        <w:t xml:space="preserve"> </w:t>
+      </w:r>
+    </w:p>
+    <w:p>
+      <w:pPr>
+        <w:pBdr>
+          <w:bottom w:val="single" w:color="C9C2B8" w:sz="4" w:space="4"/>
+        </w:pBdr>
+        <w:spacing w:after="0" w:before="170"/>
+      </w:pPr>
+      <w:r>
+        <w:rPr>
+          <w:rFonts w:ascii="Lato" w:cs="Lato" w:eastAsia="Lato" w:hAnsi="Lato"/>
+        </w:rPr>
+        <w:t xml:space="preserve"> </w:t>
+      </w:r>
+    </w:p>
+    <w:p>
+      <w:pPr>
+        <w:pBdr>
+          <w:bottom w:val="single" w:color="C9C2B8" w:sz="4" w:space="4"/>
+        </w:pBdr>
+        <w:spacing w:after="0" w:before="170"/>
+      </w:pPr>
+      <w:r>
+        <w:rPr>
+          <w:rFonts w:ascii="Lato" w:cs="Lato" w:eastAsia="Lato" w:hAnsi="Lato"/>
+        </w:rPr>
+        <w:t xml:space="preserve"> </w:t>
+      </w:r>
+    </w:p>
+    <w:p>
+      <w:pPr>
+        <w:pBdr>
+          <w:bottom w:val="single" w:color="C9C2B8" w:sz="4" w:space="4"/>
+        </w:pBdr>
+        <w:spacing w:after="0" w:before="170"/>
+      </w:pPr>
+      <w:r>
+        <w:rPr>
+          <w:rFonts w:ascii="Lato" w:cs="Lato" w:eastAsia="Lato" w:hAnsi="Lato"/>
+        </w:rPr>
+        <w:t xml:space="preserve"> </w:t>
+      </w:r>
+    </w:p>
+    <w:p>
+      <w:pPr>
+        <w:pBdr>
+          <w:bottom w:val="single" w:color="C9C2B8" w:sz="4" w:space="4"/>
+        </w:pBdr>
+        <w:spacing w:after="0" w:before="170"/>
+      </w:pPr>
+      <w:r>
+        <w:rPr>
+          <w:rFonts w:ascii="Lato" w:cs="Lato" w:eastAsia="Lato" w:hAnsi="Lato"/>
+        </w:rPr>
+        <w:t xml:space="preserve"> </w:t>
+      </w:r>
+    </w:p>
+    <w:p>
+      <w:pPr>
+        <w:spacing w:after="260"/>
       </w:pPr>
       <w:r>
         <w:rPr>
@@ -8693,8 +8943,133 @@
         <w:pBdr>
           <w:bottom w:val="single" w:color="E5DFD6" w:sz="4" w:space="6"/>
         </w:pBdr>
-        <w:spacing w:after="130"/>
+        <w:spacing w:after="200"/>
         <w:ind w:left="200"/>
+      </w:pPr>
+      <w:r>
+        <w:rPr>
+          <w:rFonts w:ascii="Lato" w:cs="Lato" w:eastAsia="Lato" w:hAnsi="Lato"/>
+        </w:rPr>
+        <w:t xml:space="preserve"/>
+      </w:r>
+    </w:p>
+    <w:p>
+      <w:pPr>
+        <w:spacing w:after="40" w:before="60"/>
+      </w:pPr>
+      <w:r>
+        <w:rPr>
+          <w:rFonts w:ascii="Lato" w:cs="Lato" w:eastAsia="Lato" w:hAnsi="Lato"/>
+          <w:b/>
+          <w:bCs/>
+          <w:color w:val="102A43"/>
+          <w:sz w:val="20"/>
+          <w:szCs w:val="20"/>
+        </w:rPr>
+        <w:t xml:space="preserve">Now write yours.</w:t>
+      </w:r>
+    </w:p>
+    <w:p>
+      <w:pPr>
+        <w:pBdr>
+          <w:bottom w:val="single" w:color="C9C2B8" w:sz="4" w:space="4"/>
+        </w:pBdr>
+        <w:spacing w:after="0" w:before="170"/>
+      </w:pPr>
+      <w:r>
+        <w:rPr>
+          <w:rFonts w:ascii="Lato" w:cs="Lato" w:eastAsia="Lato" w:hAnsi="Lato"/>
+        </w:rPr>
+        <w:t xml:space="preserve"> </w:t>
+      </w:r>
+    </w:p>
+    <w:p>
+      <w:pPr>
+        <w:pBdr>
+          <w:bottom w:val="single" w:color="C9C2B8" w:sz="4" w:space="4"/>
+        </w:pBdr>
+        <w:spacing w:after="0" w:before="170"/>
+      </w:pPr>
+      <w:r>
+        <w:rPr>
+          <w:rFonts w:ascii="Lato" w:cs="Lato" w:eastAsia="Lato" w:hAnsi="Lato"/>
+        </w:rPr>
+        <w:t xml:space="preserve"> </w:t>
+      </w:r>
+    </w:p>
+    <w:p>
+      <w:pPr>
+        <w:pBdr>
+          <w:bottom w:val="single" w:color="C9C2B8" w:sz="4" w:space="4"/>
+        </w:pBdr>
+        <w:spacing w:after="0" w:before="170"/>
+      </w:pPr>
+      <w:r>
+        <w:rPr>
+          <w:rFonts w:ascii="Lato" w:cs="Lato" w:eastAsia="Lato" w:hAnsi="Lato"/>
+        </w:rPr>
+        <w:t xml:space="preserve"> </w:t>
+      </w:r>
+    </w:p>
+    <w:p>
+      <w:pPr>
+        <w:pBdr>
+          <w:bottom w:val="single" w:color="C9C2B8" w:sz="4" w:space="4"/>
+        </w:pBdr>
+        <w:spacing w:after="0" w:before="170"/>
+      </w:pPr>
+      <w:r>
+        <w:rPr>
+          <w:rFonts w:ascii="Lato" w:cs="Lato" w:eastAsia="Lato" w:hAnsi="Lato"/>
+        </w:rPr>
+        <w:t xml:space="preserve"> </w:t>
+      </w:r>
+    </w:p>
+    <w:p>
+      <w:pPr>
+        <w:pBdr>
+          <w:bottom w:val="single" w:color="C9C2B8" w:sz="4" w:space="4"/>
+        </w:pBdr>
+        <w:spacing w:after="0" w:before="170"/>
+      </w:pPr>
+      <w:r>
+        <w:rPr>
+          <w:rFonts w:ascii="Lato" w:cs="Lato" w:eastAsia="Lato" w:hAnsi="Lato"/>
+        </w:rPr>
+        <w:t xml:space="preserve"> </w:t>
+      </w:r>
+    </w:p>
+    <w:p>
+      <w:pPr>
+        <w:pBdr>
+          <w:bottom w:val="single" w:color="C9C2B8" w:sz="4" w:space="4"/>
+        </w:pBdr>
+        <w:spacing w:after="0" w:before="170"/>
+      </w:pPr>
+      <w:r>
+        <w:rPr>
+          <w:rFonts w:ascii="Lato" w:cs="Lato" w:eastAsia="Lato" w:hAnsi="Lato"/>
+        </w:rPr>
+        <w:t xml:space="preserve"> </w:t>
+      </w:r>
+    </w:p>
+    <w:p>
+      <w:pPr>
+        <w:pBdr>
+          <w:bottom w:val="single" w:color="C9C2B8" w:sz="4" w:space="4"/>
+        </w:pBdr>
+        <w:spacing w:after="0" w:before="170"/>
+      </w:pPr>
+      <w:r>
+        <w:rPr>
+          <w:rFonts w:ascii="Lato" w:cs="Lato" w:eastAsia="Lato" w:hAnsi="Lato"/>
+        </w:rPr>
+        <w:t xml:space="preserve"> </w:t>
+      </w:r>
+    </w:p>
+    <w:p>
+      <w:pPr>
+        <w:spacing w:after="260"/>
       </w:pPr>
       <w:r>
         <w:rPr>
@@ -8878,8 +9253,133 @@
         <w:pBdr>
           <w:bottom w:val="single" w:color="E5DFD6" w:sz="4" w:space="6"/>
         </w:pBdr>
-        <w:spacing w:after="130"/>
+        <w:spacing w:after="200"/>
         <w:ind w:left="200"/>
+      </w:pPr>
+      <w:r>
+        <w:rPr>
+          <w:rFonts w:ascii="Lato" w:cs="Lato" w:eastAsia="Lato" w:hAnsi="Lato"/>
+        </w:rPr>
+        <w:t xml:space="preserve"/>
+      </w:r>
+    </w:p>
+    <w:p>
+      <w:pPr>
+        <w:spacing w:after="40" w:before="60"/>
+      </w:pPr>
+      <w:r>
+        <w:rPr>
+          <w:rFonts w:ascii="Lato" w:cs="Lato" w:eastAsia="Lato" w:hAnsi="Lato"/>
+          <w:b/>
+          <w:bCs/>
+          <w:color w:val="102A43"/>
+          <w:sz w:val="20"/>
+          <w:szCs w:val="20"/>
+        </w:rPr>
+        <w:t xml:space="preserve">Now write yours.</w:t>
+      </w:r>
+    </w:p>
+    <w:p>
+      <w:pPr>
+        <w:pBdr>
+          <w:bottom w:val="single" w:color="C9C2B8" w:sz="4" w:space="4"/>
+        </w:pBdr>
+        <w:spacing w:after="0" w:before="170"/>
+      </w:pPr>
+      <w:r>
+        <w:rPr>
+          <w:rFonts w:ascii="Lato" w:cs="Lato" w:eastAsia="Lato" w:hAnsi="Lato"/>
+        </w:rPr>
+        <w:t xml:space="preserve"> </w:t>
+      </w:r>
+    </w:p>
+    <w:p>
+      <w:pPr>
+        <w:pBdr>
+          <w:bottom w:val="single" w:color="C9C2B8" w:sz="4" w:space="4"/>
+        </w:pBdr>
+        <w:spacing w:after="0" w:before="170"/>
+      </w:pPr>
+      <w:r>
+        <w:rPr>
+          <w:rFonts w:ascii="Lato" w:cs="Lato" w:eastAsia="Lato" w:hAnsi="Lato"/>
+        </w:rPr>
+        <w:t xml:space="preserve"> </w:t>
+      </w:r>
+    </w:p>
+    <w:p>
+      <w:pPr>
+        <w:pBdr>
+          <w:bottom w:val="single" w:color="C9C2B8" w:sz="4" w:space="4"/>
+        </w:pBdr>
+        <w:spacing w:after="0" w:before="170"/>
+      </w:pPr>
+      <w:r>
+        <w:rPr>
+          <w:rFonts w:ascii="Lato" w:cs="Lato" w:eastAsia="Lato" w:hAnsi="Lato"/>
+        </w:rPr>
+        <w:t xml:space="preserve"> </w:t>
+      </w:r>
+    </w:p>
+    <w:p>
+      <w:pPr>
+        <w:pBdr>
+          <w:bottom w:val="single" w:color="C9C2B8" w:sz="4" w:space="4"/>
+        </w:pBdr>
+        <w:spacing w:after="0" w:before="170"/>
+      </w:pPr>
+      <w:r>
+        <w:rPr>
+          <w:rFonts w:ascii="Lato" w:cs="Lato" w:eastAsia="Lato" w:hAnsi="Lato"/>
+        </w:rPr>
+        <w:t xml:space="preserve"> </w:t>
+      </w:r>
+    </w:p>
+    <w:p>
+      <w:pPr>
+        <w:pBdr>
+          <w:bottom w:val="single" w:color="C9C2B8" w:sz="4" w:space="4"/>
+        </w:pBdr>
+        <w:spacing w:after="0" w:before="170"/>
+      </w:pPr>
+      <w:r>
+        <w:rPr>
+          <w:rFonts w:ascii="Lato" w:cs="Lato" w:eastAsia="Lato" w:hAnsi="Lato"/>
+        </w:rPr>
+        <w:t xml:space="preserve"> </w:t>
+      </w:r>
+    </w:p>
+    <w:p>
+      <w:pPr>
+        <w:pBdr>
+          <w:bottom w:val="single" w:color="C9C2B8" w:sz="4" w:space="4"/>
+        </w:pBdr>
+        <w:spacing w:after="0" w:before="170"/>
+      </w:pPr>
+      <w:r>
+        <w:rPr>
+          <w:rFonts w:ascii="Lato" w:cs="Lato" w:eastAsia="Lato" w:hAnsi="Lato"/>
+        </w:rPr>
+        <w:t xml:space="preserve"> </w:t>
+      </w:r>
+    </w:p>
+    <w:p>
+      <w:pPr>
+        <w:pBdr>
+          <w:bottom w:val="single" w:color="C9C2B8" w:sz="4" w:space="4"/>
+        </w:pBdr>
+        <w:spacing w:after="0" w:before="170"/>
+      </w:pPr>
+      <w:r>
+        <w:rPr>
+          <w:rFonts w:ascii="Lato" w:cs="Lato" w:eastAsia="Lato" w:hAnsi="Lato"/>
+        </w:rPr>
+        <w:t xml:space="preserve"> </w:t>
+      </w:r>
+    </w:p>
+    <w:p>
+      <w:pPr>
+        <w:spacing w:after="260"/>
       </w:pPr>
       <w:r>
         <w:rPr>

</xml_diff>

<commit_message>
book: add Chapter 16 "Your First Sale"
Covers the gap between a live shop and a paying customer: the list of ten
real people to tell, two written ask templates plus space to write your
own, telling them three times, what to do in the hour after a sale, the
feedback ask that becomes a testimonial, and a diagnosis order for a
quiet launch (nobody saw it / wrong people saw it / they did not believe
it) so the response to silence is not rebuilding the product.

Business Basics moves to 17, It's Go Time to 18. Contents page updated.

Co-Authored-By: Claude Opus 5 <noreply@anthropic.com>
Claude-Session: https://claude.ai/code/session_01TjUUnX46NGL9Rs94eLWYcA
</commit_message>
<xml_diff>
--- a/book/Muslimah-Faceless-Business-Blueprint.docx
+++ b/book/Muslimah-Faceless-Business-Blueprint.docx
@@ -693,7 +693,7 @@
           <w:sz w:val="20"/>
           <w:szCs w:val="20"/>
         </w:rPr>
-        <w:t xml:space="preserve">   Business Basics</w:t>
+        <w:t xml:space="preserve">   Your First Sale</w:t>
       </w:r>
     </w:p>
     <w:p>
@@ -710,6 +710,31 @@
           <w:szCs w:val="17"/>
         </w:rPr>
         <w:t xml:space="preserve">17</w:t>
+      </w:r>
+      <w:r>
+        <w:rPr>
+          <w:rFonts w:ascii="Libre Baskerville" w:cs="Libre Baskerville" w:eastAsia="Libre Baskerville" w:hAnsi="Libre Baskerville"/>
+          <w:color w:val="102A43"/>
+          <w:sz w:val="20"/>
+          <w:szCs w:val="20"/>
+        </w:rPr>
+        <w:t xml:space="preserve">   Business Basics</w:t>
+      </w:r>
+    </w:p>
+    <w:p>
+      <w:pPr>
+        <w:spacing w:after="130"/>
+      </w:pPr>
+      <w:r>
+        <w:rPr>
+          <w:rFonts w:ascii="Lato" w:cs="Lato" w:eastAsia="Lato" w:hAnsi="Lato"/>
+          <w:b/>
+          <w:bCs/>
+          <w:color w:val="D6A23E"/>
+          <w:sz w:val="17"/>
+          <w:szCs w:val="17"/>
+        </w:rPr>
+        <w:t xml:space="preserve">18</w:t>
       </w:r>
       <w:r>
         <w:rPr>
@@ -18080,7 +18105,7 @@
           <w:sz w:val="36"/>
           <w:szCs w:val="36"/>
         </w:rPr>
-        <w:t xml:space="preserve">Business Basics</w:t>
+        <w:t xml:space="preserve">Your First Sale</w:t>
       </w:r>
     </w:p>
     <w:p>
@@ -18110,7 +18135,23 @@
           <w:sz w:val="21"/>
           <w:szCs w:val="21"/>
         </w:rPr>
-        <w:t xml:space="preserve">This is not legal advice, and requirements vary by country and by state. Talk to a professional about anything specific to your situation. But a few basics apply broadly, and knowing them early saves a mess later.</w:t>
+        <w:t xml:space="preserve">Everything up to here was building. This chapter is the part nobody tells you about: the gap between a shop that is live and a human being who has paid you.</w:t>
+      </w:r>
+    </w:p>
+    <w:p>
+      <w:pPr>
+        <w:spacing w:after="150" w:line="300"/>
+      </w:pPr>
+      <w:r>
+        <w:rPr>
+          <w:rFonts w:ascii="Lato" w:cs="Lato" w:eastAsia="Lato" w:hAnsi="Lato"/>
+          <w:i w:val="false"/>
+          <w:iCs w:val="false"/>
+          <w:color w:val="2B2B2B"/>
+          <w:sz w:val="21"/>
+          <w:szCs w:val="21"/>
+        </w:rPr>
+        <w:t xml:space="preserve">That gap is almost never closed by more building. It is closed by asking. A product nobody has been told about has not been launched — it has been uploaded.</w:t>
       </w:r>
     </w:p>
     <w:p>
@@ -18125,7 +18166,39 @@
           <w:sz w:val="24"/>
           <w:szCs w:val="24"/>
         </w:rPr>
-        <w:t xml:space="preserve">If you are setting up formally</w:t>
+        <w:t xml:space="preserve">Your first buyer is already nearby</w:t>
+      </w:r>
+    </w:p>
+    <w:p>
+      <w:pPr>
+        <w:spacing w:after="150" w:line="300"/>
+      </w:pPr>
+      <w:r>
+        <w:rPr>
+          <w:rFonts w:ascii="Lato" w:cs="Lato" w:eastAsia="Lato" w:hAnsi="Lato"/>
+          <w:i w:val="false"/>
+          <w:iCs w:val="false"/>
+          <w:color w:val="2B2B2B"/>
+          <w:sz w:val="21"/>
+          <w:szCs w:val="21"/>
+        </w:rPr>
+        <w:t xml:space="preserve">Almost nobody’s first sale comes from a stranger who found them by chance. It comes from someone who was already within reach: a subscriber, someone who replied to a Story, a woman in a group you are both in, a person who asked you a question two months ago.</w:t>
+      </w:r>
+    </w:p>
+    <w:p>
+      <w:pPr>
+        <w:spacing w:after="150" w:line="300"/>
+      </w:pPr>
+      <w:r>
+        <w:rPr>
+          <w:rFonts w:ascii="Lato" w:cs="Lato" w:eastAsia="Lato" w:hAnsi="Lato"/>
+          <w:i w:val="false"/>
+          <w:iCs w:val="false"/>
+          <w:color w:val="2B2B2B"/>
+          <w:sz w:val="21"/>
+          <w:szCs w:val="21"/>
+        </w:rPr>
+        <w:t xml:space="preserve">So before you think about reach, make a list. Not a strategy — a list of actual people.</w:t>
       </w:r>
     </w:p>
     <w:p>
@@ -18144,7 +18217,7 @@
           <w:sz w:val="21"/>
           <w:szCs w:val="21"/>
         </w:rPr>
-        <w:t xml:space="preserve">Choose and register a business name. Check availability before you fall in love with one.</w:t>
+        <w:t xml:space="preserve">Everyone on your email list, however small. Twelve people is a list.</w:t>
       </w:r>
     </w:p>
     <w:p>
@@ -18163,7 +18236,7 @@
           <w:sz w:val="21"/>
           <w:szCs w:val="21"/>
         </w:rPr>
-        <w:t xml:space="preserve">Decide on a structure. Many beginners start as a sole trader or a single-member LLC.</w:t>
+        <w:t xml:space="preserve">Anyone who has replied to you, ever — a comment, a DM, an email.</w:t>
       </w:r>
     </w:p>
     <w:p>
@@ -18182,7 +18255,7 @@
           <w:sz w:val="21"/>
           <w:szCs w:val="21"/>
         </w:rPr>
-        <w:t xml:space="preserve">Get whatever tax registration your country requires. In the US that is an EIN, free, directly from the IRS website — never pay a third party for one.</w:t>
+        <w:t xml:space="preserve">People in groups or communities where you are genuinely a participant, not a lurker with a link.</w:t>
       </w:r>
     </w:p>
     <w:p>
@@ -18201,7 +18274,7 @@
           <w:sz w:val="21"/>
           <w:szCs w:val="21"/>
         </w:rPr>
-        <w:t xml:space="preserve">Learn your tax obligations early, and get an accountant once you are making real sales. Not before.</w:t>
+        <w:t xml:space="preserve">Anyone who has asked you the question your product answers.</w:t>
       </w:r>
     </w:p>
     <w:p>
@@ -18220,7 +18293,190 @@
           <w:sz w:val="21"/>
           <w:szCs w:val="21"/>
         </w:rPr>
-        <w:t xml:space="preserve">Open a separate bank account so personal and business money do not mix. Do this on day one; it costs nothing and saves hours later.</w:t>
+        <w:t xml:space="preserve">People you know offline who fit, if you are comfortable with that. You do not have to be.</w:t>
+      </w:r>
+    </w:p>
+    <w:p>
+      <w:pPr>
+        <w:spacing w:after="40" w:before="260"/>
+      </w:pPr>
+      <w:r>
+        <w:rPr>
+          <w:rFonts w:ascii="Lato" w:cs="Lato" w:eastAsia="Lato" w:hAnsi="Lato"/>
+          <w:b/>
+          <w:bCs/>
+          <w:color w:val="102A43"/>
+          <w:sz w:val="20"/>
+          <w:szCs w:val="20"/>
+        </w:rPr>
+        <w:t xml:space="preserve">Ten people I could tell about this by name</w:t>
+      </w:r>
+    </w:p>
+    <w:p>
+      <w:pPr>
+        <w:pBdr>
+          <w:bottom w:val="single" w:color="C9C2B8" w:sz="4" w:space="4"/>
+        </w:pBdr>
+        <w:spacing w:after="0" w:before="170"/>
+      </w:pPr>
+      <w:r>
+        <w:rPr>
+          <w:rFonts w:ascii="Lato" w:cs="Lato" w:eastAsia="Lato" w:hAnsi="Lato"/>
+        </w:rPr>
+        <w:t xml:space="preserve"> </w:t>
+      </w:r>
+    </w:p>
+    <w:p>
+      <w:pPr>
+        <w:pBdr>
+          <w:bottom w:val="single" w:color="C9C2B8" w:sz="4" w:space="4"/>
+        </w:pBdr>
+        <w:spacing w:after="0" w:before="170"/>
+      </w:pPr>
+      <w:r>
+        <w:rPr>
+          <w:rFonts w:ascii="Lato" w:cs="Lato" w:eastAsia="Lato" w:hAnsi="Lato"/>
+        </w:rPr>
+        <w:t xml:space="preserve"> </w:t>
+      </w:r>
+    </w:p>
+    <w:p>
+      <w:pPr>
+        <w:pBdr>
+          <w:bottom w:val="single" w:color="C9C2B8" w:sz="4" w:space="4"/>
+        </w:pBdr>
+        <w:spacing w:after="0" w:before="170"/>
+      </w:pPr>
+      <w:r>
+        <w:rPr>
+          <w:rFonts w:ascii="Lato" w:cs="Lato" w:eastAsia="Lato" w:hAnsi="Lato"/>
+        </w:rPr>
+        <w:t xml:space="preserve"> </w:t>
+      </w:r>
+    </w:p>
+    <w:p>
+      <w:pPr>
+        <w:pBdr>
+          <w:bottom w:val="single" w:color="C9C2B8" w:sz="4" w:space="4"/>
+        </w:pBdr>
+        <w:spacing w:after="0" w:before="170"/>
+      </w:pPr>
+      <w:r>
+        <w:rPr>
+          <w:rFonts w:ascii="Lato" w:cs="Lato" w:eastAsia="Lato" w:hAnsi="Lato"/>
+        </w:rPr>
+        <w:t xml:space="preserve"> </w:t>
+      </w:r>
+    </w:p>
+    <w:p>
+      <w:pPr>
+        <w:pBdr>
+          <w:bottom w:val="single" w:color="C9C2B8" w:sz="4" w:space="4"/>
+        </w:pBdr>
+        <w:spacing w:after="0" w:before="170"/>
+      </w:pPr>
+      <w:r>
+        <w:rPr>
+          <w:rFonts w:ascii="Lato" w:cs="Lato" w:eastAsia="Lato" w:hAnsi="Lato"/>
+        </w:rPr>
+        <w:t xml:space="preserve"> </w:t>
+      </w:r>
+    </w:p>
+    <w:p>
+      <w:pPr>
+        <w:pBdr>
+          <w:bottom w:val="single" w:color="C9C2B8" w:sz="4" w:space="4"/>
+        </w:pBdr>
+        <w:spacing w:after="0" w:before="170"/>
+      </w:pPr>
+      <w:r>
+        <w:rPr>
+          <w:rFonts w:ascii="Lato" w:cs="Lato" w:eastAsia="Lato" w:hAnsi="Lato"/>
+        </w:rPr>
+        <w:t xml:space="preserve"> </w:t>
+      </w:r>
+    </w:p>
+    <w:p>
+      <w:pPr>
+        <w:pBdr>
+          <w:bottom w:val="single" w:color="C9C2B8" w:sz="4" w:space="4"/>
+        </w:pBdr>
+        <w:spacing w:after="0" w:before="170"/>
+      </w:pPr>
+      <w:r>
+        <w:rPr>
+          <w:rFonts w:ascii="Lato" w:cs="Lato" w:eastAsia="Lato" w:hAnsi="Lato"/>
+        </w:rPr>
+        <w:t xml:space="preserve"> </w:t>
+      </w:r>
+    </w:p>
+    <w:p>
+      <w:pPr>
+        <w:pBdr>
+          <w:bottom w:val="single" w:color="C9C2B8" w:sz="4" w:space="4"/>
+        </w:pBdr>
+        <w:spacing w:after="0" w:before="170"/>
+      </w:pPr>
+      <w:r>
+        <w:rPr>
+          <w:rFonts w:ascii="Lato" w:cs="Lato" w:eastAsia="Lato" w:hAnsi="Lato"/>
+        </w:rPr>
+        <w:t xml:space="preserve"> </w:t>
+      </w:r>
+    </w:p>
+    <w:p>
+      <w:pPr>
+        <w:pBdr>
+          <w:bottom w:val="single" w:color="C9C2B8" w:sz="4" w:space="4"/>
+        </w:pBdr>
+        <w:spacing w:after="0" w:before="170"/>
+      </w:pPr>
+      <w:r>
+        <w:rPr>
+          <w:rFonts w:ascii="Lato" w:cs="Lato" w:eastAsia="Lato" w:hAnsi="Lato"/>
+        </w:rPr>
+        <w:t xml:space="preserve"> </w:t>
+      </w:r>
+    </w:p>
+    <w:p>
+      <w:pPr>
+        <w:pBdr>
+          <w:bottom w:val="single" w:color="C9C2B8" w:sz="4" w:space="4"/>
+        </w:pBdr>
+        <w:spacing w:after="0" w:before="170"/>
+      </w:pPr>
+      <w:r>
+        <w:rPr>
+          <w:rFonts w:ascii="Lato" w:cs="Lato" w:eastAsia="Lato" w:hAnsi="Lato"/>
+        </w:rPr>
+        <w:t xml:space="preserve"> </w:t>
+      </w:r>
+    </w:p>
+    <w:p>
+      <w:pPr>
+        <w:spacing w:after="210"/>
+      </w:pPr>
+      <w:r>
+        <w:rPr>
+          <w:rFonts w:ascii="Lato" w:cs="Lato" w:eastAsia="Lato" w:hAnsi="Lato"/>
+        </w:rPr>
+        <w:t xml:space="preserve"/>
+      </w:r>
+    </w:p>
+    <w:p>
+      <w:pPr>
+        <w:spacing w:after="150" w:line="300"/>
+      </w:pPr>
+      <w:r>
+        <w:rPr>
+          <w:rFonts w:ascii="Lato" w:cs="Lato" w:eastAsia="Lato" w:hAnsi="Lato"/>
+          <w:i w:val="false"/>
+          <w:iCs w:val="false"/>
+          <w:color w:val="2B2B2B"/>
+          <w:sz w:val="21"/>
+          <w:szCs w:val="21"/>
+        </w:rPr>
+        <w:t xml:space="preserve">If you cannot fill ten lines, that is not a reason to skip ahead. It is the actual first task: go and have ten conversations before you go and have a launch.</w:t>
       </w:r>
     </w:p>
     <w:p>
@@ -18235,7 +18491,7 @@
           <w:sz w:val="24"/>
           <w:szCs w:val="24"/>
         </w:rPr>
-        <w:t xml:space="preserve">Your own work</w:t>
+        <w:t xml:space="preserve">The ask, written down</w:t>
       </w:r>
     </w:p>
     <w:p>
@@ -18251,23 +18507,1464 @@
           <w:sz w:val="21"/>
           <w:szCs w:val="21"/>
         </w:rPr>
-        <w:t xml:space="preserve">Protect what you make. If you sell something you created, be clear in your terms about what the buyer is allowed to do with it — use it, yes; resell it, no, unless you decide otherwise. Being explicit protects you and prevents an awkward conversation later.</w:t>
-      </w:r>
-    </w:p>
-    <w:p>
-      <w:pPr>
-        <w:spacing w:after="40" w:before="260"/>
+        <w:t xml:space="preserve">The reason most first sales do not happen is that the ask never gets made clearly. People hint. They post a pretty graphic and hope. Hoping is not asking.</w:t>
+      </w:r>
+    </w:p>
+    <w:p>
+      <w:pPr>
+        <w:spacing w:after="150" w:line="300"/>
+      </w:pPr>
+      <w:r>
+        <w:rPr>
+          <w:rFonts w:ascii="Lato" w:cs="Lato" w:eastAsia="Lato" w:hAnsi="Lato"/>
+          <w:i w:val="false"/>
+          <w:iCs w:val="false"/>
+          <w:color w:val="2B2B2B"/>
+          <w:sz w:val="21"/>
+          <w:szCs w:val="21"/>
+        </w:rPr>
+        <w:t xml:space="preserve">A good ask does four things: names who it is for, says what it changes, gives the price, and tells them exactly what to do next. It takes three sentences and it does not need to be clever.</w:t>
+      </w:r>
+    </w:p>
+    <w:p>
+      <w:pPr>
+        <w:spacing w:after="0" w:before="250"/>
+        <w:ind w:left="200"/>
       </w:pPr>
       <w:r>
         <w:rPr>
           <w:rFonts w:ascii="Lato" w:cs="Lato" w:eastAsia="Lato" w:hAnsi="Lato"/>
           <w:b/>
           <w:bCs/>
-          <w:color w:val="102A43"/>
-          <w:sz w:val="20"/>
-          <w:szCs w:val="20"/>
-        </w:rPr>
-        <w:t xml:space="preserve">My next admin step, and the date I will do it</w:t>
+          <w:color w:val="D6A23E"/>
+          <w:spacing w:val="50"/>
+          <w:sz w:val="16"/>
+          <w:szCs w:val="16"/>
+        </w:rPr>
+        <w:t xml:space="preserve">ASK — TO SOMEONE WHO ALREADY ASKED YOU THE QUESTION</w:t>
+      </w:r>
+    </w:p>
+    <w:p>
+      <w:pPr>
+        <w:spacing w:after="110" w:before="70"/>
+        <w:ind w:left="200"/>
+      </w:pPr>
+      <w:r>
+        <w:rPr>
+          <w:rFonts w:ascii="Lato" w:cs="Lato" w:eastAsia="Lato" w:hAnsi="Lato"/>
+          <w:b/>
+          <w:bCs/>
+          <w:color w:val="102A43"/>
+          <w:sz w:val="20"/>
+          <w:szCs w:val="20"/>
+        </w:rPr>
+        <w:t xml:space="preserve">Subject: the thing you asked me about</w:t>
+      </w:r>
+    </w:p>
+    <w:p>
+      <w:pPr>
+        <w:spacing w:after="90" w:line="280"/>
+        <w:ind w:left="200"/>
+      </w:pPr>
+      <w:r>
+        <w:rPr>
+          <w:rFonts w:ascii="Lato" w:cs="Lato" w:eastAsia="Lato" w:hAnsi="Lato"/>
+          <w:color w:val="2B2B2B"/>
+          <w:sz w:val="20"/>
+          <w:szCs w:val="20"/>
+        </w:rPr>
+        <w:t xml:space="preserve">Hi [name] — you asked me a while back about [their exact question]. I have just finished something that answers it properly: [product name], a [format] that walks through [the one outcome].</w:t>
+      </w:r>
+    </w:p>
+    <w:p>
+      <w:pPr>
+        <w:spacing w:after="90" w:line="280"/>
+        <w:ind w:left="200"/>
+      </w:pPr>
+      <w:r>
+        <w:rPr>
+          <w:rFonts w:ascii="Lato" w:cs="Lato" w:eastAsia="Lato" w:hAnsi="Lato"/>
+          <w:color w:val="2B2B2B"/>
+          <w:sz w:val="20"/>
+          <w:szCs w:val="20"/>
+        </w:rPr>
+        <w:t xml:space="preserve">It is [price], and it is here: [link].</w:t>
+      </w:r>
+    </w:p>
+    <w:p>
+      <w:pPr>
+        <w:spacing w:after="90" w:line="280"/>
+        <w:ind w:left="200"/>
+      </w:pPr>
+      <w:r>
+        <w:rPr>
+          <w:rFonts w:ascii="Lato" w:cs="Lato" w:eastAsia="Lato" w:hAnsi="Lato"/>
+          <w:color w:val="2B2B2B"/>
+          <w:sz w:val="20"/>
+          <w:szCs w:val="20"/>
+        </w:rPr>
+        <w:t xml:space="preserve">If it is not the right time, that is completely fine — no need to reply. I just did not want to make the thing and then not tell the person who asked for it.</w:t>
+      </w:r>
+    </w:p>
+    <w:p>
+      <w:pPr>
+        <w:pBdr>
+          <w:bottom w:val="single" w:color="E5DFD6" w:sz="4" w:space="6"/>
+        </w:pBdr>
+        <w:spacing w:after="200"/>
+        <w:ind w:left="200"/>
+      </w:pPr>
+      <w:r>
+        <w:rPr>
+          <w:rFonts w:ascii="Lato" w:cs="Lato" w:eastAsia="Lato" w:hAnsi="Lato"/>
+        </w:rPr>
+        <w:t xml:space="preserve"/>
+      </w:r>
+    </w:p>
+    <w:p>
+      <w:pPr>
+        <w:spacing w:after="40" w:before="60"/>
+      </w:pPr>
+      <w:r>
+        <w:rPr>
+          <w:rFonts w:ascii="Lato" w:cs="Lato" w:eastAsia="Lato" w:hAnsi="Lato"/>
+          <w:b/>
+          <w:bCs/>
+          <w:color w:val="102A43"/>
+          <w:sz w:val="20"/>
+          <w:szCs w:val="20"/>
+        </w:rPr>
+        <w:t xml:space="preserve">Now write yours.</w:t>
+      </w:r>
+    </w:p>
+    <w:p>
+      <w:pPr>
+        <w:pBdr>
+          <w:bottom w:val="single" w:color="C9C2B8" w:sz="4" w:space="4"/>
+        </w:pBdr>
+        <w:spacing w:after="0" w:before="170"/>
+      </w:pPr>
+      <w:r>
+        <w:rPr>
+          <w:rFonts w:ascii="Lato" w:cs="Lato" w:eastAsia="Lato" w:hAnsi="Lato"/>
+        </w:rPr>
+        <w:t xml:space="preserve"> </w:t>
+      </w:r>
+    </w:p>
+    <w:p>
+      <w:pPr>
+        <w:pBdr>
+          <w:bottom w:val="single" w:color="C9C2B8" w:sz="4" w:space="4"/>
+        </w:pBdr>
+        <w:spacing w:after="0" w:before="170"/>
+      </w:pPr>
+      <w:r>
+        <w:rPr>
+          <w:rFonts w:ascii="Lato" w:cs="Lato" w:eastAsia="Lato" w:hAnsi="Lato"/>
+        </w:rPr>
+        <w:t xml:space="preserve"> </w:t>
+      </w:r>
+    </w:p>
+    <w:p>
+      <w:pPr>
+        <w:pBdr>
+          <w:bottom w:val="single" w:color="C9C2B8" w:sz="4" w:space="4"/>
+        </w:pBdr>
+        <w:spacing w:after="0" w:before="170"/>
+      </w:pPr>
+      <w:r>
+        <w:rPr>
+          <w:rFonts w:ascii="Lato" w:cs="Lato" w:eastAsia="Lato" w:hAnsi="Lato"/>
+        </w:rPr>
+        <w:t xml:space="preserve"> </w:t>
+      </w:r>
+    </w:p>
+    <w:p>
+      <w:pPr>
+        <w:pBdr>
+          <w:bottom w:val="single" w:color="C9C2B8" w:sz="4" w:space="4"/>
+        </w:pBdr>
+        <w:spacing w:after="0" w:before="170"/>
+      </w:pPr>
+      <w:r>
+        <w:rPr>
+          <w:rFonts w:ascii="Lato" w:cs="Lato" w:eastAsia="Lato" w:hAnsi="Lato"/>
+        </w:rPr>
+        <w:t xml:space="preserve"> </w:t>
+      </w:r>
+    </w:p>
+    <w:p>
+      <w:pPr>
+        <w:pBdr>
+          <w:bottom w:val="single" w:color="C9C2B8" w:sz="4" w:space="4"/>
+        </w:pBdr>
+        <w:spacing w:after="0" w:before="170"/>
+      </w:pPr>
+      <w:r>
+        <w:rPr>
+          <w:rFonts w:ascii="Lato" w:cs="Lato" w:eastAsia="Lato" w:hAnsi="Lato"/>
+        </w:rPr>
+        <w:t xml:space="preserve"> </w:t>
+      </w:r>
+    </w:p>
+    <w:p>
+      <w:pPr>
+        <w:pBdr>
+          <w:bottom w:val="single" w:color="C9C2B8" w:sz="4" w:space="4"/>
+        </w:pBdr>
+        <w:spacing w:after="0" w:before="170"/>
+      </w:pPr>
+      <w:r>
+        <w:rPr>
+          <w:rFonts w:ascii="Lato" w:cs="Lato" w:eastAsia="Lato" w:hAnsi="Lato"/>
+        </w:rPr>
+        <w:t xml:space="preserve"> </w:t>
+      </w:r>
+    </w:p>
+    <w:p>
+      <w:pPr>
+        <w:pBdr>
+          <w:bottom w:val="single" w:color="C9C2B8" w:sz="4" w:space="4"/>
+        </w:pBdr>
+        <w:spacing w:after="0" w:before="170"/>
+      </w:pPr>
+      <w:r>
+        <w:rPr>
+          <w:rFonts w:ascii="Lato" w:cs="Lato" w:eastAsia="Lato" w:hAnsi="Lato"/>
+        </w:rPr>
+        <w:t xml:space="preserve"> </w:t>
+      </w:r>
+    </w:p>
+    <w:p>
+      <w:pPr>
+        <w:spacing w:after="260"/>
+      </w:pPr>
+      <w:r>
+        <w:rPr>
+          <w:rFonts w:ascii="Lato" w:cs="Lato" w:eastAsia="Lato" w:hAnsi="Lato"/>
+        </w:rPr>
+        <w:t xml:space="preserve"/>
+      </w:r>
+    </w:p>
+    <w:p>
+      <w:pPr>
+        <w:spacing w:after="0" w:before="250"/>
+        <w:ind w:left="200"/>
+      </w:pPr>
+      <w:r>
+        <w:rPr>
+          <w:rFonts w:ascii="Lato" w:cs="Lato" w:eastAsia="Lato" w:hAnsi="Lato"/>
+          <w:b/>
+          <w:bCs/>
+          <w:color w:val="D6A23E"/>
+          <w:spacing w:val="50"/>
+          <w:sz w:val="16"/>
+          <w:szCs w:val="16"/>
+        </w:rPr>
+        <w:t xml:space="preserve">ASK — TO YOUR EMAIL LIST</w:t>
+      </w:r>
+    </w:p>
+    <w:p>
+      <w:pPr>
+        <w:spacing w:after="110" w:before="70"/>
+        <w:ind w:left="200"/>
+      </w:pPr>
+      <w:r>
+        <w:rPr>
+          <w:rFonts w:ascii="Lato" w:cs="Lato" w:eastAsia="Lato" w:hAnsi="Lato"/>
+          <w:b/>
+          <w:bCs/>
+          <w:color w:val="102A43"/>
+          <w:sz w:val="20"/>
+          <w:szCs w:val="20"/>
+        </w:rPr>
+        <w:t xml:space="preserve">Subject: I made the thing</w:t>
+      </w:r>
+    </w:p>
+    <w:p>
+      <w:pPr>
+        <w:spacing w:after="90" w:line="280"/>
+        <w:ind w:left="200"/>
+      </w:pPr>
+      <w:r>
+        <w:rPr>
+          <w:rFonts w:ascii="Lato" w:cs="Lato" w:eastAsia="Lato" w:hAnsi="Lato"/>
+          <w:color w:val="2B2B2B"/>
+          <w:sz w:val="20"/>
+          <w:szCs w:val="20"/>
+        </w:rPr>
+        <w:t xml:space="preserve">I have been working on something for the last few weeks and it is finally done.</w:t>
+      </w:r>
+    </w:p>
+    <w:p>
+      <w:pPr>
+        <w:spacing w:after="90" w:line="280"/>
+        <w:ind w:left="200"/>
+      </w:pPr>
+      <w:r>
+        <w:rPr>
+          <w:rFonts w:ascii="Lato" w:cs="Lato" w:eastAsia="Lato" w:hAnsi="Lato"/>
+          <w:color w:val="2B2B2B"/>
+          <w:sz w:val="20"/>
+          <w:szCs w:val="20"/>
+        </w:rPr>
+        <w:t xml:space="preserve">[Product name] is for [who] who want to [outcome] without [the thing they dread]. It includes [two or three concrete things]. It takes about [time] to work through.</w:t>
+      </w:r>
+    </w:p>
+    <w:p>
+      <w:pPr>
+        <w:spacing w:after="90" w:line="280"/>
+        <w:ind w:left="200"/>
+      </w:pPr>
+      <w:r>
+        <w:rPr>
+          <w:rFonts w:ascii="Lato" w:cs="Lato" w:eastAsia="Lato" w:hAnsi="Lato"/>
+          <w:color w:val="2B2B2B"/>
+          <w:sz w:val="20"/>
+          <w:szCs w:val="20"/>
+        </w:rPr>
+        <w:t xml:space="preserve">It is [price] until [date], then [higher price]. You can get it here: [link].</w:t>
+      </w:r>
+    </w:p>
+    <w:p>
+      <w:pPr>
+        <w:spacing w:after="90" w:line="280"/>
+        <w:ind w:left="200"/>
+      </w:pPr>
+      <w:r>
+        <w:rPr>
+          <w:rFonts w:ascii="Lato" w:cs="Lato" w:eastAsia="Lato" w:hAnsi="Lato"/>
+          <w:color w:val="2B2B2B"/>
+          <w:sz w:val="20"/>
+          <w:szCs w:val="20"/>
+        </w:rPr>
+        <w:t xml:space="preserve">If you have questions before you buy, reply to this email — it comes straight to me.</w:t>
+      </w:r>
+    </w:p>
+    <w:p>
+      <w:pPr>
+        <w:pBdr>
+          <w:bottom w:val="single" w:color="E5DFD6" w:sz="4" w:space="6"/>
+        </w:pBdr>
+        <w:spacing w:after="200"/>
+        <w:ind w:left="200"/>
+      </w:pPr>
+      <w:r>
+        <w:rPr>
+          <w:rFonts w:ascii="Lato" w:cs="Lato" w:eastAsia="Lato" w:hAnsi="Lato"/>
+        </w:rPr>
+        <w:t xml:space="preserve"/>
+      </w:r>
+    </w:p>
+    <w:p>
+      <w:pPr>
+        <w:spacing w:after="40" w:before="60"/>
+      </w:pPr>
+      <w:r>
+        <w:rPr>
+          <w:rFonts w:ascii="Lato" w:cs="Lato" w:eastAsia="Lato" w:hAnsi="Lato"/>
+          <w:b/>
+          <w:bCs/>
+          <w:color w:val="102A43"/>
+          <w:sz w:val="20"/>
+          <w:szCs w:val="20"/>
+        </w:rPr>
+        <w:t xml:space="preserve">Now write yours.</w:t>
+      </w:r>
+    </w:p>
+    <w:p>
+      <w:pPr>
+        <w:pBdr>
+          <w:bottom w:val="single" w:color="C9C2B8" w:sz="4" w:space="4"/>
+        </w:pBdr>
+        <w:spacing w:after="0" w:before="170"/>
+      </w:pPr>
+      <w:r>
+        <w:rPr>
+          <w:rFonts w:ascii="Lato" w:cs="Lato" w:eastAsia="Lato" w:hAnsi="Lato"/>
+        </w:rPr>
+        <w:t xml:space="preserve"> </w:t>
+      </w:r>
+    </w:p>
+    <w:p>
+      <w:pPr>
+        <w:pBdr>
+          <w:bottom w:val="single" w:color="C9C2B8" w:sz="4" w:space="4"/>
+        </w:pBdr>
+        <w:spacing w:after="0" w:before="170"/>
+      </w:pPr>
+      <w:r>
+        <w:rPr>
+          <w:rFonts w:ascii="Lato" w:cs="Lato" w:eastAsia="Lato" w:hAnsi="Lato"/>
+        </w:rPr>
+        <w:t xml:space="preserve"> </w:t>
+      </w:r>
+    </w:p>
+    <w:p>
+      <w:pPr>
+        <w:pBdr>
+          <w:bottom w:val="single" w:color="C9C2B8" w:sz="4" w:space="4"/>
+        </w:pBdr>
+        <w:spacing w:after="0" w:before="170"/>
+      </w:pPr>
+      <w:r>
+        <w:rPr>
+          <w:rFonts w:ascii="Lato" w:cs="Lato" w:eastAsia="Lato" w:hAnsi="Lato"/>
+        </w:rPr>
+        <w:t xml:space="preserve"> </w:t>
+      </w:r>
+    </w:p>
+    <w:p>
+      <w:pPr>
+        <w:pBdr>
+          <w:bottom w:val="single" w:color="C9C2B8" w:sz="4" w:space="4"/>
+        </w:pBdr>
+        <w:spacing w:after="0" w:before="170"/>
+      </w:pPr>
+      <w:r>
+        <w:rPr>
+          <w:rFonts w:ascii="Lato" w:cs="Lato" w:eastAsia="Lato" w:hAnsi="Lato"/>
+        </w:rPr>
+        <w:t xml:space="preserve"> </w:t>
+      </w:r>
+    </w:p>
+    <w:p>
+      <w:pPr>
+        <w:pBdr>
+          <w:bottom w:val="single" w:color="C9C2B8" w:sz="4" w:space="4"/>
+        </w:pBdr>
+        <w:spacing w:after="0" w:before="170"/>
+      </w:pPr>
+      <w:r>
+        <w:rPr>
+          <w:rFonts w:ascii="Lato" w:cs="Lato" w:eastAsia="Lato" w:hAnsi="Lato"/>
+        </w:rPr>
+        <w:t xml:space="preserve"> </w:t>
+      </w:r>
+    </w:p>
+    <w:p>
+      <w:pPr>
+        <w:pBdr>
+          <w:bottom w:val="single" w:color="C9C2B8" w:sz="4" w:space="4"/>
+        </w:pBdr>
+        <w:spacing w:after="0" w:before="170"/>
+      </w:pPr>
+      <w:r>
+        <w:rPr>
+          <w:rFonts w:ascii="Lato" w:cs="Lato" w:eastAsia="Lato" w:hAnsi="Lato"/>
+        </w:rPr>
+        <w:t xml:space="preserve"> </w:t>
+      </w:r>
+    </w:p>
+    <w:p>
+      <w:pPr>
+        <w:pBdr>
+          <w:bottom w:val="single" w:color="C9C2B8" w:sz="4" w:space="4"/>
+        </w:pBdr>
+        <w:spacing w:after="0" w:before="170"/>
+      </w:pPr>
+      <w:r>
+        <w:rPr>
+          <w:rFonts w:ascii="Lato" w:cs="Lato" w:eastAsia="Lato" w:hAnsi="Lato"/>
+        </w:rPr>
+        <w:t xml:space="preserve"> </w:t>
+      </w:r>
+    </w:p>
+    <w:p>
+      <w:pPr>
+        <w:spacing w:after="260"/>
+      </w:pPr>
+      <w:r>
+        <w:rPr>
+          <w:rFonts w:ascii="Lato" w:cs="Lato" w:eastAsia="Lato" w:hAnsi="Lato"/>
+        </w:rPr>
+        <w:t xml:space="preserve"/>
+      </w:r>
+    </w:p>
+    <w:p>
+      <w:pPr>
+        <w:pBdr>
+          <w:left w:val="single" w:color="D6A23E" w:sz="18" w:space="14"/>
+        </w:pBdr>
+        <w:spacing w:after="40" w:before="190"/>
+        <w:ind w:left="230"/>
+      </w:pPr>
+      <w:r>
+        <w:rPr>
+          <w:rFonts w:ascii="Lato" w:cs="Lato" w:eastAsia="Lato" w:hAnsi="Lato"/>
+          <w:b/>
+          <w:bCs/>
+          <w:color w:val="D6A23E"/>
+          <w:spacing w:val="50"/>
+          <w:sz w:val="16"/>
+          <w:szCs w:val="16"/>
+        </w:rPr>
+        <w:t xml:space="preserve">BEFORE YOU MOVE ON</w:t>
+      </w:r>
+    </w:p>
+    <w:p>
+      <w:pPr>
+        <w:pBdr>
+          <w:left w:val="single" w:color="D6A23E" w:sz="18" w:space="14"/>
+        </w:pBdr>
+        <w:spacing w:after="200"/>
+        <w:ind w:left="230"/>
+      </w:pPr>
+      <w:r>
+        <w:rPr>
+          <w:rFonts w:ascii="Lato" w:cs="Lato" w:eastAsia="Lato" w:hAnsi="Lato"/>
+          <w:color w:val="2B2B2B"/>
+          <w:sz w:val="20"/>
+          <w:szCs w:val="20"/>
+        </w:rPr>
+        <w:t xml:space="preserve">Do not apologise in the ask. “Sorry to bother you”, “I know everyone is selling something” and “no pressure at all, honestly” all tell the reader you are not sure it is worth the money. If you are not sure, fix the product. If you are sure, say the price and stop talking.</w:t>
+      </w:r>
+    </w:p>
+    <w:p>
+      <w:pPr>
+        <w:spacing w:after="40" w:before="260"/>
+      </w:pPr>
+      <w:r>
+        <w:rPr>
+          <w:rFonts w:ascii="Lato" w:cs="Lato" w:eastAsia="Lato" w:hAnsi="Lato"/>
+          <w:b/>
+          <w:bCs/>
+          <w:color w:val="102A43"/>
+          <w:sz w:val="20"/>
+          <w:szCs w:val="20"/>
+        </w:rPr>
+        <w:t xml:space="preserve">My ask, written out in full, in my own words</w:t>
+      </w:r>
+    </w:p>
+    <w:p>
+      <w:pPr>
+        <w:pBdr>
+          <w:bottom w:val="single" w:color="C9C2B8" w:sz="4" w:space="4"/>
+        </w:pBdr>
+        <w:spacing w:after="0" w:before="170"/>
+      </w:pPr>
+      <w:r>
+        <w:rPr>
+          <w:rFonts w:ascii="Lato" w:cs="Lato" w:eastAsia="Lato" w:hAnsi="Lato"/>
+        </w:rPr>
+        <w:t xml:space="preserve"> </w:t>
+      </w:r>
+    </w:p>
+    <w:p>
+      <w:pPr>
+        <w:pBdr>
+          <w:bottom w:val="single" w:color="C9C2B8" w:sz="4" w:space="4"/>
+        </w:pBdr>
+        <w:spacing w:after="0" w:before="170"/>
+      </w:pPr>
+      <w:r>
+        <w:rPr>
+          <w:rFonts w:ascii="Lato" w:cs="Lato" w:eastAsia="Lato" w:hAnsi="Lato"/>
+        </w:rPr>
+        <w:t xml:space="preserve"> </w:t>
+      </w:r>
+    </w:p>
+    <w:p>
+      <w:pPr>
+        <w:pBdr>
+          <w:bottom w:val="single" w:color="C9C2B8" w:sz="4" w:space="4"/>
+        </w:pBdr>
+        <w:spacing w:after="0" w:before="170"/>
+      </w:pPr>
+      <w:r>
+        <w:rPr>
+          <w:rFonts w:ascii="Lato" w:cs="Lato" w:eastAsia="Lato" w:hAnsi="Lato"/>
+        </w:rPr>
+        <w:t xml:space="preserve"> </w:t>
+      </w:r>
+    </w:p>
+    <w:p>
+      <w:pPr>
+        <w:pBdr>
+          <w:bottom w:val="single" w:color="C9C2B8" w:sz="4" w:space="4"/>
+        </w:pBdr>
+        <w:spacing w:after="0" w:before="170"/>
+      </w:pPr>
+      <w:r>
+        <w:rPr>
+          <w:rFonts w:ascii="Lato" w:cs="Lato" w:eastAsia="Lato" w:hAnsi="Lato"/>
+        </w:rPr>
+        <w:t xml:space="preserve"> </w:t>
+      </w:r>
+    </w:p>
+    <w:p>
+      <w:pPr>
+        <w:pBdr>
+          <w:bottom w:val="single" w:color="C9C2B8" w:sz="4" w:space="4"/>
+        </w:pBdr>
+        <w:spacing w:after="0" w:before="170"/>
+      </w:pPr>
+      <w:r>
+        <w:rPr>
+          <w:rFonts w:ascii="Lato" w:cs="Lato" w:eastAsia="Lato" w:hAnsi="Lato"/>
+        </w:rPr>
+        <w:t xml:space="preserve"> </w:t>
+      </w:r>
+    </w:p>
+    <w:p>
+      <w:pPr>
+        <w:pBdr>
+          <w:bottom w:val="single" w:color="C9C2B8" w:sz="4" w:space="4"/>
+        </w:pBdr>
+        <w:spacing w:after="0" w:before="170"/>
+      </w:pPr>
+      <w:r>
+        <w:rPr>
+          <w:rFonts w:ascii="Lato" w:cs="Lato" w:eastAsia="Lato" w:hAnsi="Lato"/>
+        </w:rPr>
+        <w:t xml:space="preserve"> </w:t>
+      </w:r>
+    </w:p>
+    <w:p>
+      <w:pPr>
+        <w:pBdr>
+          <w:bottom w:val="single" w:color="C9C2B8" w:sz="4" w:space="4"/>
+        </w:pBdr>
+        <w:spacing w:after="0" w:before="170"/>
+      </w:pPr>
+      <w:r>
+        <w:rPr>
+          <w:rFonts w:ascii="Lato" w:cs="Lato" w:eastAsia="Lato" w:hAnsi="Lato"/>
+        </w:rPr>
+        <w:t xml:space="preserve"> </w:t>
+      </w:r>
+    </w:p>
+    <w:p>
+      <w:pPr>
+        <w:pBdr>
+          <w:bottom w:val="single" w:color="C9C2B8" w:sz="4" w:space="4"/>
+        </w:pBdr>
+        <w:spacing w:after="0" w:before="170"/>
+      </w:pPr>
+      <w:r>
+        <w:rPr>
+          <w:rFonts w:ascii="Lato" w:cs="Lato" w:eastAsia="Lato" w:hAnsi="Lato"/>
+        </w:rPr>
+        <w:t xml:space="preserve"> </w:t>
+      </w:r>
+    </w:p>
+    <w:p>
+      <w:pPr>
+        <w:spacing w:after="210"/>
+      </w:pPr>
+      <w:r>
+        <w:rPr>
+          <w:rFonts w:ascii="Lato" w:cs="Lato" w:eastAsia="Lato" w:hAnsi="Lato"/>
+        </w:rPr>
+        <w:t xml:space="preserve"/>
+      </w:r>
+    </w:p>
+    <w:p>
+      <w:pPr>
+        <w:pStyle w:val="Heading2"/>
+        <w:spacing w:after="140" w:before="330"/>
+      </w:pPr>
+      <w:r>
+        <w:rPr>
+          <w:rFonts w:ascii="Libre Baskerville" w:cs="Libre Baskerville" w:eastAsia="Libre Baskerville" w:hAnsi="Libre Baskerville"/>
+          <w:color w:val="102A43"/>
+          <w:sz w:val="24"/>
+          <w:szCs w:val="24"/>
+        </w:rPr>
+        <w:t xml:space="preserve">Tell them more than once</w:t>
+      </w:r>
+    </w:p>
+    <w:p>
+      <w:pPr>
+        <w:spacing w:after="150" w:line="300"/>
+      </w:pPr>
+      <w:r>
+        <w:rPr>
+          <w:rFonts w:ascii="Lato" w:cs="Lato" w:eastAsia="Lato" w:hAnsi="Lato"/>
+          <w:i w:val="false"/>
+          <w:iCs w:val="false"/>
+          <w:color w:val="2B2B2B"/>
+          <w:sz w:val="21"/>
+          <w:szCs w:val="21"/>
+        </w:rPr>
+        <w:t xml:space="preserve">You will feel like you are repeating yourself long before your audience does. On any given day most of your people do not see what you post. Saying it three times is not pushy; it is the minimum required for one person to hear it once.</w:t>
+      </w:r>
+    </w:p>
+    <w:p>
+      <w:pPr>
+        <w:pStyle w:val="ListParagraph"/>
+        <w:numPr>
+          <w:ilvl w:val="0"/>
+          <w:numId w:val="2"/>
+        </w:numPr>
+        <w:spacing w:after="90" w:line="290"/>
+      </w:pPr>
+      <w:r>
+        <w:rPr>
+          <w:rFonts w:ascii="Lato" w:cs="Lato" w:eastAsia="Lato" w:hAnsi="Lato"/>
+          <w:color w:val="2B2B2B"/>
+          <w:sz w:val="21"/>
+          <w:szCs w:val="21"/>
+        </w:rPr>
+        <w:t xml:space="preserve">Before: you are making something, and who it is for. This is not a teaser — it is a filter.</w:t>
+      </w:r>
+    </w:p>
+    <w:p>
+      <w:pPr>
+        <w:pStyle w:val="ListParagraph"/>
+        <w:numPr>
+          <w:ilvl w:val="0"/>
+          <w:numId w:val="2"/>
+        </w:numPr>
+        <w:spacing w:after="90" w:line="290"/>
+      </w:pPr>
+      <w:r>
+        <w:rPr>
+          <w:rFonts w:ascii="Lato" w:cs="Lato" w:eastAsia="Lato" w:hAnsi="Lato"/>
+          <w:color w:val="2B2B2B"/>
+          <w:sz w:val="21"/>
+          <w:szCs w:val="21"/>
+        </w:rPr>
+        <w:t xml:space="preserve">The day: what it is, what it costs, where to get it.</w:t>
+      </w:r>
+    </w:p>
+    <w:p>
+      <w:pPr>
+        <w:pStyle w:val="ListParagraph"/>
+        <w:numPr>
+          <w:ilvl w:val="0"/>
+          <w:numId w:val="2"/>
+        </w:numPr>
+        <w:spacing w:after="90" w:line="290"/>
+      </w:pPr>
+      <w:r>
+        <w:rPr>
+          <w:rFonts w:ascii="Lato" w:cs="Lato" w:eastAsia="Lato" w:hAnsi="Lato"/>
+          <w:color w:val="2B2B2B"/>
+          <w:sz w:val="21"/>
+          <w:szCs w:val="21"/>
+        </w:rPr>
+        <w:t xml:space="preserve">After: the same thing said differently — a question you got, a piece of it, who it is not for.</w:t>
+      </w:r>
+    </w:p>
+    <w:p>
+      <w:pPr>
+        <w:spacing w:after="150" w:line="300"/>
+      </w:pPr>
+      <w:r>
+        <w:rPr>
+          <w:rFonts w:ascii="Lato" w:cs="Lato" w:eastAsia="Lato" w:hAnsi="Lato"/>
+          <w:i w:val="false"/>
+          <w:iCs w:val="false"/>
+          <w:color w:val="2B2B2B"/>
+          <w:sz w:val="21"/>
+          <w:szCs w:val="21"/>
+        </w:rPr>
+        <w:t xml:space="preserve">That last one is the one people skip and it converts the best. Saying plainly who should not buy this is the fastest trust you will ever build.</w:t>
+      </w:r>
+    </w:p>
+    <w:p>
+      <w:pPr>
+        <w:pStyle w:val="Heading2"/>
+        <w:spacing w:after="140" w:before="330"/>
+      </w:pPr>
+      <w:r>
+        <w:rPr>
+          <w:rFonts w:ascii="Libre Baskerville" w:cs="Libre Baskerville" w:eastAsia="Libre Baskerville" w:hAnsi="Libre Baskerville"/>
+          <w:color w:val="102A43"/>
+          <w:sz w:val="24"/>
+          <w:szCs w:val="24"/>
+        </w:rPr>
+        <w:t xml:space="preserve">When someone actually buys</w:t>
+      </w:r>
+    </w:p>
+    <w:p>
+      <w:pPr>
+        <w:spacing w:after="150" w:line="300"/>
+      </w:pPr>
+      <w:r>
+        <w:rPr>
+          <w:rFonts w:ascii="Lato" w:cs="Lato" w:eastAsia="Lato" w:hAnsi="Lato"/>
+          <w:i w:val="false"/>
+          <w:iCs w:val="false"/>
+          <w:color w:val="2B2B2B"/>
+          <w:sz w:val="21"/>
+          <w:szCs w:val="21"/>
+        </w:rPr>
+        <w:t xml:space="preserve">The first sale is a small, strange, enormous thing. Here is what to do in the hour after it.</w:t>
+      </w:r>
+    </w:p>
+    <w:p>
+      <w:pPr>
+        <w:spacing w:after="60" w:line="280"/>
+        <w:ind w:left="200"/>
+      </w:pPr>
+      <w:r>
+        <w:rPr>
+          <w:rFonts w:ascii="Lato" w:cs="Lato" w:eastAsia="Lato" w:hAnsi="Lato"/>
+          <w:color w:val="D6A23E"/>
+          <w:sz w:val="22"/>
+          <w:szCs w:val="22"/>
+        </w:rPr>
+        <w:t xml:space="preserve">▢   </w:t>
+      </w:r>
+      <w:r>
+        <w:rPr>
+          <w:rFonts w:ascii="Lato" w:cs="Lato" w:eastAsia="Lato" w:hAnsi="Lato"/>
+          <w:color w:val="2B2B2B"/>
+          <w:sz w:val="21"/>
+          <w:szCs w:val="21"/>
+        </w:rPr>
+        <w:t xml:space="preserve">Check they received the product. Do not assume the automation worked — this is the one time you verify by hand.</w:t>
+      </w:r>
+    </w:p>
+    <w:p>
+      <w:pPr>
+        <w:spacing w:after="60" w:line="280"/>
+        <w:ind w:left="200"/>
+      </w:pPr>
+      <w:r>
+        <w:rPr>
+          <w:rFonts w:ascii="Lato" w:cs="Lato" w:eastAsia="Lato" w:hAnsi="Lato"/>
+          <w:color w:val="D6A23E"/>
+          <w:sz w:val="22"/>
+          <w:szCs w:val="22"/>
+        </w:rPr>
+        <w:t xml:space="preserve">▢   </w:t>
+      </w:r>
+      <w:r>
+        <w:rPr>
+          <w:rFonts w:ascii="Lato" w:cs="Lato" w:eastAsia="Lato" w:hAnsi="Lato"/>
+          <w:color w:val="2B2B2B"/>
+          <w:sz w:val="21"/>
+          <w:szCs w:val="21"/>
+        </w:rPr>
+        <w:t xml:space="preserve">Send a short personal message. Not a template. Two sentences from you.</w:t>
+      </w:r>
+    </w:p>
+    <w:p>
+      <w:pPr>
+        <w:spacing w:after="60" w:line="280"/>
+        <w:ind w:left="200"/>
+      </w:pPr>
+      <w:r>
+        <w:rPr>
+          <w:rFonts w:ascii="Lato" w:cs="Lato" w:eastAsia="Lato" w:hAnsi="Lato"/>
+          <w:color w:val="D6A23E"/>
+          <w:sz w:val="22"/>
+          <w:szCs w:val="22"/>
+        </w:rPr>
+        <w:t xml:space="preserve">▢   </w:t>
+      </w:r>
+      <w:r>
+        <w:rPr>
+          <w:rFonts w:ascii="Lato" w:cs="Lato" w:eastAsia="Lato" w:hAnsi="Lato"/>
+          <w:color w:val="2B2B2B"/>
+          <w:sz w:val="21"/>
+          <w:szCs w:val="21"/>
+        </w:rPr>
+        <w:t xml:space="preserve">Write down what they bought, when, and where they came from. This is your first piece of real data.</w:t>
+      </w:r>
+    </w:p>
+    <w:p>
+      <w:pPr>
+        <w:spacing w:after="60" w:line="280"/>
+        <w:ind w:left="200"/>
+      </w:pPr>
+      <w:r>
+        <w:rPr>
+          <w:rFonts w:ascii="Lato" w:cs="Lato" w:eastAsia="Lato" w:hAnsi="Lato"/>
+          <w:color w:val="D6A23E"/>
+          <w:sz w:val="22"/>
+          <w:szCs w:val="22"/>
+        </w:rPr>
+        <w:t xml:space="preserve">▢   </w:t>
+      </w:r>
+      <w:r>
+        <w:rPr>
+          <w:rFonts w:ascii="Lato" w:cs="Lato" w:eastAsia="Lato" w:hAnsi="Lato"/>
+          <w:color w:val="2B2B2B"/>
+          <w:sz w:val="21"/>
+          <w:szCs w:val="21"/>
+        </w:rPr>
+        <w:t xml:space="preserve">Make the du‘a. Then get back to work — one sale is proof, not a business.</w:t>
+      </w:r>
+    </w:p>
+    <w:p>
+      <w:pPr>
+        <w:pBdr>
+          <w:left w:val="single" w:color="D6A23E" w:sz="18" w:space="14"/>
+        </w:pBdr>
+        <w:spacing w:after="40" w:before="190"/>
+        <w:ind w:left="230"/>
+      </w:pPr>
+      <w:r>
+        <w:rPr>
+          <w:rFonts w:ascii="Lato" w:cs="Lato" w:eastAsia="Lato" w:hAnsi="Lato"/>
+          <w:b/>
+          <w:bCs/>
+          <w:color w:val="D6A23E"/>
+          <w:spacing w:val="50"/>
+          <w:sz w:val="16"/>
+          <w:szCs w:val="16"/>
+        </w:rPr>
+        <w:t xml:space="preserve">TIP</w:t>
+      </w:r>
+    </w:p>
+    <w:p>
+      <w:pPr>
+        <w:pBdr>
+          <w:left w:val="single" w:color="D6A23E" w:sz="18" w:space="14"/>
+        </w:pBdr>
+        <w:spacing w:after="200"/>
+        <w:ind w:left="230"/>
+      </w:pPr>
+      <w:r>
+        <w:rPr>
+          <w:rFonts w:ascii="Lato" w:cs="Lato" w:eastAsia="Lato" w:hAnsi="Lato"/>
+          <w:color w:val="2B2B2B"/>
+          <w:sz w:val="20"/>
+          <w:szCs w:val="20"/>
+        </w:rPr>
+        <w:t xml:space="preserve">Leave the automated welcome email in place and send the personal note on top of it. The automation proves the system works. The note proves you do.</w:t>
+      </w:r>
+    </w:p>
+    <w:p>
+      <w:pPr>
+        <w:pStyle w:val="Heading2"/>
+        <w:spacing w:after="140" w:before="330"/>
+      </w:pPr>
+      <w:r>
+        <w:rPr>
+          <w:rFonts w:ascii="Libre Baskerville" w:cs="Libre Baskerville" w:eastAsia="Libre Baskerville" w:hAnsi="Libre Baskerville"/>
+          <w:color w:val="102A43"/>
+          <w:sz w:val="24"/>
+          <w:szCs w:val="24"/>
+        </w:rPr>
+        <w:t xml:space="preserve">The feedback ask</w:t>
+      </w:r>
+    </w:p>
+    <w:p>
+      <w:pPr>
+        <w:spacing w:after="150" w:line="300"/>
+      </w:pPr>
+      <w:r>
+        <w:rPr>
+          <w:rFonts w:ascii="Lato" w:cs="Lato" w:eastAsia="Lato" w:hAnsi="Lato"/>
+          <w:i w:val="false"/>
+          <w:iCs w:val="false"/>
+          <w:color w:val="2B2B2B"/>
+          <w:sz w:val="21"/>
+          <w:szCs w:val="21"/>
+        </w:rPr>
+        <w:t xml:space="preserve">A few days later, ask for feedback — not a testimonial. People freeze when you ask for a testimonial because they think they have to write copy. Feedback is easy to give, and it turns into a testimonial once you have it.</w:t>
+      </w:r>
+    </w:p>
+    <w:p>
+      <w:pPr>
+        <w:spacing w:after="150" w:line="300"/>
+      </w:pPr>
+      <w:r>
+        <w:rPr>
+          <w:rFonts w:ascii="Lato" w:cs="Lato" w:eastAsia="Lato" w:hAnsi="Lato"/>
+          <w:i w:val="false"/>
+          <w:iCs w:val="false"/>
+          <w:color w:val="2B2B2B"/>
+          <w:sz w:val="21"/>
+          <w:szCs w:val="21"/>
+        </w:rPr>
+        <w:t xml:space="preserve">Ask three specific questions rather than one open one:</w:t>
+      </w:r>
+    </w:p>
+    <w:p>
+      <w:pPr>
+        <w:pStyle w:val="ListParagraph"/>
+        <w:numPr>
+          <w:ilvl w:val="0"/>
+          <w:numId w:val="2"/>
+        </w:numPr>
+        <w:spacing w:after="90" w:line="290"/>
+      </w:pPr>
+      <w:r>
+        <w:rPr>
+          <w:rFonts w:ascii="Lato" w:cs="Lato" w:eastAsia="Lato" w:hAnsi="Lato"/>
+          <w:color w:val="2B2B2B"/>
+          <w:sz w:val="21"/>
+          <w:szCs w:val="21"/>
+        </w:rPr>
+        <w:t xml:space="preserve">What were you struggling with before you bought this?</w:t>
+      </w:r>
+    </w:p>
+    <w:p>
+      <w:pPr>
+        <w:pStyle w:val="ListParagraph"/>
+        <w:numPr>
+          <w:ilvl w:val="0"/>
+          <w:numId w:val="2"/>
+        </w:numPr>
+        <w:spacing w:after="90" w:line="290"/>
+      </w:pPr>
+      <w:r>
+        <w:rPr>
+          <w:rFonts w:ascii="Lato" w:cs="Lato" w:eastAsia="Lato" w:hAnsi="Lato"/>
+          <w:color w:val="2B2B2B"/>
+          <w:sz w:val="21"/>
+          <w:szCs w:val="21"/>
+        </w:rPr>
+        <w:t xml:space="preserve">What has changed, if anything?</w:t>
+      </w:r>
+    </w:p>
+    <w:p>
+      <w:pPr>
+        <w:pStyle w:val="ListParagraph"/>
+        <w:numPr>
+          <w:ilvl w:val="0"/>
+          <w:numId w:val="2"/>
+        </w:numPr>
+        <w:spacing w:after="90" w:line="290"/>
+      </w:pPr>
+      <w:r>
+        <w:rPr>
+          <w:rFonts w:ascii="Lato" w:cs="Lato" w:eastAsia="Lato" w:hAnsi="Lato"/>
+          <w:color w:val="2B2B2B"/>
+          <w:sz w:val="21"/>
+          <w:szCs w:val="21"/>
+        </w:rPr>
+        <w:t xml:space="preserve">Was there anything confusing or missing?</w:t>
+      </w:r>
+    </w:p>
+    <w:p>
+      <w:pPr>
+        <w:spacing w:after="150" w:line="300"/>
+      </w:pPr>
+      <w:r>
+        <w:rPr>
+          <w:rFonts w:ascii="Lato" w:cs="Lato" w:eastAsia="Lato" w:hAnsi="Lato"/>
+          <w:i w:val="false"/>
+          <w:iCs w:val="false"/>
+          <w:color w:val="2B2B2B"/>
+          <w:sz w:val="21"/>
+          <w:szCs w:val="21"/>
+        </w:rPr>
+        <w:t xml:space="preserve">Then ask permission: “Would you mind if I shared part of your answer, with your first name?” Most people say yes. The ones who say no are telling you something useful about the product.</w:t>
+      </w:r>
+    </w:p>
+    <w:p>
+      <w:pPr>
+        <w:spacing w:after="40" w:before="260"/>
+      </w:pPr>
+      <w:r>
+        <w:rPr>
+          <w:rFonts w:ascii="Lato" w:cs="Lato" w:eastAsia="Lato" w:hAnsi="Lato"/>
+          <w:b/>
+          <w:bCs/>
+          <w:color w:val="102A43"/>
+          <w:sz w:val="20"/>
+          <w:szCs w:val="20"/>
+        </w:rPr>
+        <w:t xml:space="preserve">My feedback questions, and who I will send them to first</w:t>
+      </w:r>
+    </w:p>
+    <w:p>
+      <w:pPr>
+        <w:pBdr>
+          <w:bottom w:val="single" w:color="C9C2B8" w:sz="4" w:space="4"/>
+        </w:pBdr>
+        <w:spacing w:after="0" w:before="170"/>
+      </w:pPr>
+      <w:r>
+        <w:rPr>
+          <w:rFonts w:ascii="Lato" w:cs="Lato" w:eastAsia="Lato" w:hAnsi="Lato"/>
+        </w:rPr>
+        <w:t xml:space="preserve"> </w:t>
+      </w:r>
+    </w:p>
+    <w:p>
+      <w:pPr>
+        <w:pBdr>
+          <w:bottom w:val="single" w:color="C9C2B8" w:sz="4" w:space="4"/>
+        </w:pBdr>
+        <w:spacing w:after="0" w:before="170"/>
+      </w:pPr>
+      <w:r>
+        <w:rPr>
+          <w:rFonts w:ascii="Lato" w:cs="Lato" w:eastAsia="Lato" w:hAnsi="Lato"/>
+        </w:rPr>
+        <w:t xml:space="preserve"> </w:t>
+      </w:r>
+    </w:p>
+    <w:p>
+      <w:pPr>
+        <w:pBdr>
+          <w:bottom w:val="single" w:color="C9C2B8" w:sz="4" w:space="4"/>
+        </w:pBdr>
+        <w:spacing w:after="0" w:before="170"/>
+      </w:pPr>
+      <w:r>
+        <w:rPr>
+          <w:rFonts w:ascii="Lato" w:cs="Lato" w:eastAsia="Lato" w:hAnsi="Lato"/>
+        </w:rPr>
+        <w:t xml:space="preserve"> </w:t>
+      </w:r>
+    </w:p>
+    <w:p>
+      <w:pPr>
+        <w:pBdr>
+          <w:bottom w:val="single" w:color="C9C2B8" w:sz="4" w:space="4"/>
+        </w:pBdr>
+        <w:spacing w:after="0" w:before="170"/>
+      </w:pPr>
+      <w:r>
+        <w:rPr>
+          <w:rFonts w:ascii="Lato" w:cs="Lato" w:eastAsia="Lato" w:hAnsi="Lato"/>
+        </w:rPr>
+        <w:t xml:space="preserve"> </w:t>
+      </w:r>
+    </w:p>
+    <w:p>
+      <w:pPr>
+        <w:spacing w:after="210"/>
+      </w:pPr>
+      <w:r>
+        <w:rPr>
+          <w:rFonts w:ascii="Lato" w:cs="Lato" w:eastAsia="Lato" w:hAnsi="Lato"/>
+        </w:rPr>
+        <w:t xml:space="preserve"/>
+      </w:r>
+    </w:p>
+    <w:p>
+      <w:pPr>
+        <w:pStyle w:val="Heading2"/>
+        <w:spacing w:after="140" w:before="330"/>
+      </w:pPr>
+      <w:r>
+        <w:rPr>
+          <w:rFonts w:ascii="Libre Baskerville" w:cs="Libre Baskerville" w:eastAsia="Libre Baskerville" w:hAnsi="Libre Baskerville"/>
+          <w:color w:val="102A43"/>
+          <w:sz w:val="24"/>
+          <w:szCs w:val="24"/>
+        </w:rPr>
+        <w:t xml:space="preserve">If nobody buys</w:t>
+      </w:r>
+    </w:p>
+    <w:p>
+      <w:pPr>
+        <w:spacing w:after="150" w:line="300"/>
+      </w:pPr>
+      <w:r>
+        <w:rPr>
+          <w:rFonts w:ascii="Lato" w:cs="Lato" w:eastAsia="Lato" w:hAnsi="Lato"/>
+          <w:i w:val="false"/>
+          <w:iCs w:val="false"/>
+          <w:color w:val="2B2B2B"/>
+          <w:sz w:val="21"/>
+          <w:szCs w:val="21"/>
+        </w:rPr>
+        <w:t xml:space="preserve">This is the part that decides whether you have a business in a year. Almost everyone’s response to silence is to rebuild the product. It is almost never the product.</w:t>
+      </w:r>
+    </w:p>
+    <w:p>
+      <w:pPr>
+        <w:spacing w:after="150" w:line="300"/>
+      </w:pPr>
+      <w:r>
+        <w:rPr>
+          <w:rFonts w:ascii="Lato" w:cs="Lato" w:eastAsia="Lato" w:hAnsi="Lato"/>
+          <w:i w:val="false"/>
+          <w:iCs w:val="false"/>
+          <w:color w:val="2B2B2B"/>
+          <w:sz w:val="21"/>
+          <w:szCs w:val="21"/>
+        </w:rPr>
+        <w:t xml:space="preserve">There are three reasons a launch goes quiet. Work them in this order, because they are in order of likelihood.</w:t>
+      </w:r>
+    </w:p>
+    <w:p>
+      <w:pPr>
+        <w:pStyle w:val="ListParagraph"/>
+        <w:numPr>
+          <w:ilvl w:val="0"/>
+          <w:numId w:val="2"/>
+        </w:numPr>
+        <w:spacing w:after="90" w:line="290"/>
+      </w:pPr>
+      <w:r>
+        <w:rPr>
+          <w:rFonts w:ascii="Lato" w:cs="Lato" w:eastAsia="Lato" w:hAnsi="Lato"/>
+          <w:color w:val="2B2B2B"/>
+          <w:sz w:val="21"/>
+          <w:szCs w:val="21"/>
+        </w:rPr>
+        <w:t xml:space="preserve">Nobody saw it. Far and away the most common. Check your actual numbers — how many people opened the email, how many watched past three seconds. If the number is tiny, you do not have an offer problem, you have a reach problem.</w:t>
+      </w:r>
+    </w:p>
+    <w:p>
+      <w:pPr>
+        <w:pStyle w:val="ListParagraph"/>
+        <w:numPr>
+          <w:ilvl w:val="0"/>
+          <w:numId w:val="2"/>
+        </w:numPr>
+        <w:spacing w:after="90" w:line="290"/>
+      </w:pPr>
+      <w:r>
+        <w:rPr>
+          <w:rFonts w:ascii="Lato" w:cs="Lato" w:eastAsia="Lato" w:hAnsi="Lato"/>
+          <w:color w:val="2B2B2B"/>
+          <w:sz w:val="21"/>
+          <w:szCs w:val="21"/>
+        </w:rPr>
+        <w:t xml:space="preserve">The wrong people saw it. Your content attracted an audience that is not the audience for this product. Common when the content is broad and the product is specific.</w:t>
+      </w:r>
+    </w:p>
+    <w:p>
+      <w:pPr>
+        <w:pStyle w:val="ListParagraph"/>
+        <w:numPr>
+          <w:ilvl w:val="0"/>
+          <w:numId w:val="2"/>
+        </w:numPr>
+        <w:spacing w:after="90" w:line="290"/>
+      </w:pPr>
+      <w:r>
+        <w:rPr>
+          <w:rFonts w:ascii="Lato" w:cs="Lato" w:eastAsia="Lato" w:hAnsi="Lato"/>
+          <w:color w:val="2B2B2B"/>
+          <w:sz w:val="21"/>
+          <w:szCs w:val="21"/>
+        </w:rPr>
+        <w:t xml:space="preserve">The right people saw it and did not believe it. Only now is it the offer — the price, the proof, the promise, or the clarity of what they actually get.</w:t>
+      </w:r>
+    </w:p>
+    <w:p>
+      <w:pPr>
+        <w:pBdr>
+          <w:left w:val="single" w:color="D6A23E" w:sz="18" w:space="14"/>
+        </w:pBdr>
+        <w:spacing w:after="40" w:before="190"/>
+        <w:ind w:left="230"/>
+      </w:pPr>
+      <w:r>
+        <w:rPr>
+          <w:rFonts w:ascii="Lato" w:cs="Lato" w:eastAsia="Lato" w:hAnsi="Lato"/>
+          <w:b/>
+          <w:bCs/>
+          <w:color w:val="D6A23E"/>
+          <w:spacing w:val="50"/>
+          <w:sz w:val="16"/>
+          <w:szCs w:val="16"/>
+        </w:rPr>
+        <w:t xml:space="preserve">FOR EXAMPLE</w:t>
+      </w:r>
+    </w:p>
+    <w:p>
+      <w:pPr>
+        <w:pBdr>
+          <w:left w:val="single" w:color="D6A23E" w:sz="18" w:space="14"/>
+        </w:pBdr>
+        <w:spacing w:after="200"/>
+        <w:ind w:left="230"/>
+      </w:pPr>
+      <w:r>
+        <w:rPr>
+          <w:rFonts w:ascii="Lato" w:cs="Lato" w:eastAsia="Lato" w:hAnsi="Lato"/>
+          <w:color w:val="2B2B2B"/>
+          <w:sz w:val="20"/>
+          <w:szCs w:val="20"/>
+        </w:rPr>
+        <w:t xml:space="preserve">Forty people opened the email and nobody bought. That is a real signal, and it is reason three. Four people opened the email and nobody bought. That is not a signal about your product at all — that is four people.</w:t>
+      </w:r>
+    </w:p>
+    <w:p>
+      <w:pPr>
+        <w:spacing w:after="150" w:line="300"/>
+      </w:pPr>
+      <w:r>
+        <w:rPr>
+          <w:rFonts w:ascii="Lato" w:cs="Lato" w:eastAsia="Lato" w:hAnsi="Lato"/>
+          <w:i w:val="false"/>
+          <w:iCs w:val="false"/>
+          <w:color w:val="2B2B2B"/>
+          <w:sz w:val="21"/>
+          <w:szCs w:val="21"/>
+        </w:rPr>
+        <w:t xml:space="preserve">Fix one thing and ask again. Do not rebuild everything, because then you will not know which change did it — and you will have spent another month not selling.</w:t>
+      </w:r>
+    </w:p>
+    <w:p>
+      <w:pPr>
+        <w:spacing w:after="40" w:before="260"/>
+      </w:pPr>
+      <w:r>
+        <w:rPr>
+          <w:rFonts w:ascii="Lato" w:cs="Lato" w:eastAsia="Lato" w:hAnsi="Lato"/>
+          <w:b/>
+          <w:bCs/>
+          <w:color w:val="102A43"/>
+          <w:sz w:val="20"/>
+          <w:szCs w:val="20"/>
+        </w:rPr>
+        <w:t xml:space="preserve">If it goes quiet: the number I will check first, and the one thing I will change</w:t>
+      </w:r>
+    </w:p>
+    <w:p>
+      <w:pPr>
+        <w:pBdr>
+          <w:bottom w:val="single" w:color="C9C2B8" w:sz="4" w:space="4"/>
+        </w:pBdr>
+        <w:spacing w:after="0" w:before="170"/>
+      </w:pPr>
+      <w:r>
+        <w:rPr>
+          <w:rFonts w:ascii="Lato" w:cs="Lato" w:eastAsia="Lato" w:hAnsi="Lato"/>
+        </w:rPr>
+        <w:t xml:space="preserve"> </w:t>
+      </w:r>
+    </w:p>
+    <w:p>
+      <w:pPr>
+        <w:pBdr>
+          <w:bottom w:val="single" w:color="C9C2B8" w:sz="4" w:space="4"/>
+        </w:pBdr>
+        <w:spacing w:after="0" w:before="170"/>
+      </w:pPr>
+      <w:r>
+        <w:rPr>
+          <w:rFonts w:ascii="Lato" w:cs="Lato" w:eastAsia="Lato" w:hAnsi="Lato"/>
+        </w:rPr>
+        <w:t xml:space="preserve"> </w:t>
+      </w:r>
+    </w:p>
+    <w:p>
+      <w:pPr>
+        <w:pBdr>
+          <w:bottom w:val="single" w:color="C9C2B8" w:sz="4" w:space="4"/>
+        </w:pBdr>
+        <w:spacing w:after="0" w:before="170"/>
+      </w:pPr>
+      <w:r>
+        <w:rPr>
+          <w:rFonts w:ascii="Lato" w:cs="Lato" w:eastAsia="Lato" w:hAnsi="Lato"/>
+        </w:rPr>
+        <w:t xml:space="preserve"> </w:t>
+      </w:r>
+    </w:p>
+    <w:p>
+      <w:pPr>
+        <w:pBdr>
+          <w:bottom w:val="single" w:color="C9C2B8" w:sz="4" w:space="4"/>
+        </w:pBdr>
+        <w:spacing w:after="0" w:before="170"/>
+      </w:pPr>
+      <w:r>
+        <w:rPr>
+          <w:rFonts w:ascii="Lato" w:cs="Lato" w:eastAsia="Lato" w:hAnsi="Lato"/>
+        </w:rPr>
+        <w:t xml:space="preserve"> </w:t>
+      </w:r>
+    </w:p>
+    <w:p>
+      <w:pPr>
+        <w:pBdr>
+          <w:bottom w:val="single" w:color="C9C2B8" w:sz="4" w:space="4"/>
+        </w:pBdr>
+        <w:spacing w:after="0" w:before="170"/>
+      </w:pPr>
+      <w:r>
+        <w:rPr>
+          <w:rFonts w:ascii="Lato" w:cs="Lato" w:eastAsia="Lato" w:hAnsi="Lato"/>
+        </w:rPr>
+        <w:t xml:space="preserve"> </w:t>
+      </w:r>
+    </w:p>
+    <w:p>
+      <w:pPr>
+        <w:spacing w:after="210"/>
+      </w:pPr>
+      <w:r>
+        <w:rPr>
+          <w:rFonts w:ascii="Lato" w:cs="Lato" w:eastAsia="Lato" w:hAnsi="Lato"/>
+        </w:rPr>
+        <w:t xml:space="preserve"/>
+      </w:r>
+    </w:p>
+    <w:p>
+      <w:pPr>
+        <w:pStyle w:val="Heading2"/>
+        <w:spacing w:after="140" w:before="330"/>
+      </w:pPr>
+      <w:r>
+        <w:rPr>
+          <w:rFonts w:ascii="Libre Baskerville" w:cs="Libre Baskerville" w:eastAsia="Libre Baskerville" w:hAnsi="Libre Baskerville"/>
+          <w:color w:val="102A43"/>
+          <w:sz w:val="24"/>
+          <w:szCs w:val="24"/>
+        </w:rPr>
+        <w:t xml:space="preserve">What the first sale is actually for</w:t>
+      </w:r>
+    </w:p>
+    <w:p>
+      <w:pPr>
+        <w:spacing w:after="150" w:line="300"/>
+      </w:pPr>
+      <w:r>
+        <w:rPr>
+          <w:rFonts w:ascii="Lato" w:cs="Lato" w:eastAsia="Lato" w:hAnsi="Lato"/>
+          <w:i w:val="false"/>
+          <w:iCs w:val="false"/>
+          <w:color w:val="2B2B2B"/>
+          <w:sz w:val="21"/>
+          <w:szCs w:val="21"/>
+        </w:rPr>
+        <w:t xml:space="preserve">It is not the money. At beginner prices the first sale will not change anything about your life.</w:t>
+      </w:r>
+    </w:p>
+    <w:p>
+      <w:pPr>
+        <w:spacing w:after="150" w:line="300"/>
+      </w:pPr>
+      <w:r>
+        <w:rPr>
+          <w:rFonts w:ascii="Lato" w:cs="Lato" w:eastAsia="Lato" w:hAnsi="Lato"/>
+          <w:i w:val="false"/>
+          <w:iCs w:val="false"/>
+          <w:color w:val="2B2B2B"/>
+          <w:sz w:val="21"/>
+          <w:szCs w:val="21"/>
+        </w:rPr>
+        <w:t xml:space="preserve">What it gives you is the end of the argument in your own head about whether a stranger will pay you. That question is what stops most people, and it cannot be answered by planning. It can only be answered by one person, once.</w:t>
+      </w:r>
+    </w:p>
+    <w:p>
+      <w:pPr>
+        <w:spacing w:after="150" w:line="300"/>
+      </w:pPr>
+      <w:r>
+        <w:rPr>
+          <w:rFonts w:ascii="Lato" w:cs="Lato" w:eastAsia="Lato" w:hAnsi="Lato"/>
+          <w:i w:val="false"/>
+          <w:iCs w:val="false"/>
+          <w:color w:val="2B2B2B"/>
+          <w:sz w:val="21"/>
+          <w:szCs w:val="21"/>
+        </w:rPr>
+        <w:t xml:space="preserve">After that the work is the same work, repeated. Which is genuinely all this is.</w:t>
+      </w:r>
+    </w:p>
+    <w:p>
+      <w:pPr>
+        <w:spacing w:after="40" w:before="260"/>
+      </w:pPr>
+      <w:r>
+        <w:rPr>
+          <w:rFonts w:ascii="Lato" w:cs="Lato" w:eastAsia="Lato" w:hAnsi="Lato"/>
+          <w:b/>
+          <w:bCs/>
+          <w:color w:val="102A43"/>
+          <w:sz w:val="20"/>
+          <w:szCs w:val="20"/>
+        </w:rPr>
+        <w:t xml:space="preserve">The date I will make my first ask — not the launch date, the day I ask a person</w:t>
       </w:r>
     </w:p>
     <w:p>
@@ -18343,6 +20040,283 @@
           <w:szCs w:val="19"/>
         </w:rPr>
         <w:t xml:space="preserve">CHAPTER 17</w:t>
+      </w:r>
+    </w:p>
+    <w:p>
+      <w:pPr>
+        <w:pStyle w:val="Heading1"/>
+        <w:spacing w:after="0" w:before="90"/>
+      </w:pPr>
+      <w:r>
+        <w:rPr>
+          <w:rFonts w:ascii="Libre Baskerville" w:cs="Libre Baskerville" w:eastAsia="Libre Baskerville" w:hAnsi="Libre Baskerville"/>
+          <w:color w:val="102A43"/>
+          <w:sz w:val="36"/>
+          <w:szCs w:val="36"/>
+        </w:rPr>
+        <w:t xml:space="preserve">Business Basics</w:t>
+      </w:r>
+    </w:p>
+    <w:p>
+      <w:pPr>
+        <w:pBdr>
+          <w:bottom w:val="single" w:color="D6A23E" w:sz="12" w:space="1"/>
+        </w:pBdr>
+        <w:spacing w:after="320" w:before="120"/>
+      </w:pPr>
+      <w:r>
+        <w:rPr>
+          <w:rFonts w:ascii="Lato" w:cs="Lato" w:eastAsia="Lato" w:hAnsi="Lato"/>
+        </w:rPr>
+        <w:t xml:space="preserve"/>
+      </w:r>
+    </w:p>
+    <w:p>
+      <w:pPr>
+        <w:spacing w:after="150" w:line="300"/>
+      </w:pPr>
+      <w:r>
+        <w:rPr>
+          <w:rFonts w:ascii="Lato" w:cs="Lato" w:eastAsia="Lato" w:hAnsi="Lato"/>
+          <w:i w:val="false"/>
+          <w:iCs w:val="false"/>
+          <w:color w:val="2B2B2B"/>
+          <w:sz w:val="21"/>
+          <w:szCs w:val="21"/>
+        </w:rPr>
+        <w:t xml:space="preserve">This is not legal advice, and requirements vary by country and by state. Talk to a professional about anything specific to your situation. But a few basics apply broadly, and knowing them early saves a mess later.</w:t>
+      </w:r>
+    </w:p>
+    <w:p>
+      <w:pPr>
+        <w:pStyle w:val="Heading2"/>
+        <w:spacing w:after="140" w:before="330"/>
+      </w:pPr>
+      <w:r>
+        <w:rPr>
+          <w:rFonts w:ascii="Libre Baskerville" w:cs="Libre Baskerville" w:eastAsia="Libre Baskerville" w:hAnsi="Libre Baskerville"/>
+          <w:color w:val="102A43"/>
+          <w:sz w:val="24"/>
+          <w:szCs w:val="24"/>
+        </w:rPr>
+        <w:t xml:space="preserve">If you are setting up formally</w:t>
+      </w:r>
+    </w:p>
+    <w:p>
+      <w:pPr>
+        <w:pStyle w:val="ListParagraph"/>
+        <w:numPr>
+          <w:ilvl w:val="0"/>
+          <w:numId w:val="2"/>
+        </w:numPr>
+        <w:spacing w:after="90" w:line="290"/>
+      </w:pPr>
+      <w:r>
+        <w:rPr>
+          <w:rFonts w:ascii="Lato" w:cs="Lato" w:eastAsia="Lato" w:hAnsi="Lato"/>
+          <w:color w:val="2B2B2B"/>
+          <w:sz w:val="21"/>
+          <w:szCs w:val="21"/>
+        </w:rPr>
+        <w:t xml:space="preserve">Choose and register a business name. Check availability before you fall in love with one.</w:t>
+      </w:r>
+    </w:p>
+    <w:p>
+      <w:pPr>
+        <w:pStyle w:val="ListParagraph"/>
+        <w:numPr>
+          <w:ilvl w:val="0"/>
+          <w:numId w:val="2"/>
+        </w:numPr>
+        <w:spacing w:after="90" w:line="290"/>
+      </w:pPr>
+      <w:r>
+        <w:rPr>
+          <w:rFonts w:ascii="Lato" w:cs="Lato" w:eastAsia="Lato" w:hAnsi="Lato"/>
+          <w:color w:val="2B2B2B"/>
+          <w:sz w:val="21"/>
+          <w:szCs w:val="21"/>
+        </w:rPr>
+        <w:t xml:space="preserve">Decide on a structure. Many beginners start as a sole trader or a single-member LLC.</w:t>
+      </w:r>
+    </w:p>
+    <w:p>
+      <w:pPr>
+        <w:pStyle w:val="ListParagraph"/>
+        <w:numPr>
+          <w:ilvl w:val="0"/>
+          <w:numId w:val="2"/>
+        </w:numPr>
+        <w:spacing w:after="90" w:line="290"/>
+      </w:pPr>
+      <w:r>
+        <w:rPr>
+          <w:rFonts w:ascii="Lato" w:cs="Lato" w:eastAsia="Lato" w:hAnsi="Lato"/>
+          <w:color w:val="2B2B2B"/>
+          <w:sz w:val="21"/>
+          <w:szCs w:val="21"/>
+        </w:rPr>
+        <w:t xml:space="preserve">Get whatever tax registration your country requires. In the US that is an EIN, free, directly from the IRS website — never pay a third party for one.</w:t>
+      </w:r>
+    </w:p>
+    <w:p>
+      <w:pPr>
+        <w:pStyle w:val="ListParagraph"/>
+        <w:numPr>
+          <w:ilvl w:val="0"/>
+          <w:numId w:val="2"/>
+        </w:numPr>
+        <w:spacing w:after="90" w:line="290"/>
+      </w:pPr>
+      <w:r>
+        <w:rPr>
+          <w:rFonts w:ascii="Lato" w:cs="Lato" w:eastAsia="Lato" w:hAnsi="Lato"/>
+          <w:color w:val="2B2B2B"/>
+          <w:sz w:val="21"/>
+          <w:szCs w:val="21"/>
+        </w:rPr>
+        <w:t xml:space="preserve">Learn your tax obligations early, and get an accountant once you are making real sales. Not before.</w:t>
+      </w:r>
+    </w:p>
+    <w:p>
+      <w:pPr>
+        <w:pStyle w:val="ListParagraph"/>
+        <w:numPr>
+          <w:ilvl w:val="0"/>
+          <w:numId w:val="2"/>
+        </w:numPr>
+        <w:spacing w:after="90" w:line="290"/>
+      </w:pPr>
+      <w:r>
+        <w:rPr>
+          <w:rFonts w:ascii="Lato" w:cs="Lato" w:eastAsia="Lato" w:hAnsi="Lato"/>
+          <w:color w:val="2B2B2B"/>
+          <w:sz w:val="21"/>
+          <w:szCs w:val="21"/>
+        </w:rPr>
+        <w:t xml:space="preserve">Open a separate bank account so personal and business money do not mix. Do this on day one; it costs nothing and saves hours later.</w:t>
+      </w:r>
+    </w:p>
+    <w:p>
+      <w:pPr>
+        <w:pStyle w:val="Heading2"/>
+        <w:spacing w:after="140" w:before="330"/>
+      </w:pPr>
+      <w:r>
+        <w:rPr>
+          <w:rFonts w:ascii="Libre Baskerville" w:cs="Libre Baskerville" w:eastAsia="Libre Baskerville" w:hAnsi="Libre Baskerville"/>
+          <w:color w:val="102A43"/>
+          <w:sz w:val="24"/>
+          <w:szCs w:val="24"/>
+        </w:rPr>
+        <w:t xml:space="preserve">Your own work</w:t>
+      </w:r>
+    </w:p>
+    <w:p>
+      <w:pPr>
+        <w:spacing w:after="150" w:line="300"/>
+      </w:pPr>
+      <w:r>
+        <w:rPr>
+          <w:rFonts w:ascii="Lato" w:cs="Lato" w:eastAsia="Lato" w:hAnsi="Lato"/>
+          <w:i w:val="false"/>
+          <w:iCs w:val="false"/>
+          <w:color w:val="2B2B2B"/>
+          <w:sz w:val="21"/>
+          <w:szCs w:val="21"/>
+        </w:rPr>
+        <w:t xml:space="preserve">Protect what you make. If you sell something you created, be clear in your terms about what the buyer is allowed to do with it — use it, yes; resell it, no, unless you decide otherwise. Being explicit protects you and prevents an awkward conversation later.</w:t>
+      </w:r>
+    </w:p>
+    <w:p>
+      <w:pPr>
+        <w:spacing w:after="40" w:before="260"/>
+      </w:pPr>
+      <w:r>
+        <w:rPr>
+          <w:rFonts w:ascii="Lato" w:cs="Lato" w:eastAsia="Lato" w:hAnsi="Lato"/>
+          <w:b/>
+          <w:bCs/>
+          <w:color w:val="102A43"/>
+          <w:sz w:val="20"/>
+          <w:szCs w:val="20"/>
+        </w:rPr>
+        <w:t xml:space="preserve">My next admin step, and the date I will do it</w:t>
+      </w:r>
+    </w:p>
+    <w:p>
+      <w:pPr>
+        <w:pBdr>
+          <w:bottom w:val="single" w:color="C9C2B8" w:sz="4" w:space="4"/>
+        </w:pBdr>
+        <w:spacing w:after="0" w:before="170"/>
+      </w:pPr>
+      <w:r>
+        <w:rPr>
+          <w:rFonts w:ascii="Lato" w:cs="Lato" w:eastAsia="Lato" w:hAnsi="Lato"/>
+        </w:rPr>
+        <w:t xml:space="preserve"> </w:t>
+      </w:r>
+    </w:p>
+    <w:p>
+      <w:pPr>
+        <w:pBdr>
+          <w:bottom w:val="single" w:color="C9C2B8" w:sz="4" w:space="4"/>
+        </w:pBdr>
+        <w:spacing w:after="0" w:before="170"/>
+      </w:pPr>
+      <w:r>
+        <w:rPr>
+          <w:rFonts w:ascii="Lato" w:cs="Lato" w:eastAsia="Lato" w:hAnsi="Lato"/>
+        </w:rPr>
+        <w:t xml:space="preserve"> </w:t>
+      </w:r>
+    </w:p>
+    <w:p>
+      <w:pPr>
+        <w:pBdr>
+          <w:bottom w:val="single" w:color="C9C2B8" w:sz="4" w:space="4"/>
+        </w:pBdr>
+        <w:spacing w:after="0" w:before="170"/>
+      </w:pPr>
+      <w:r>
+        <w:rPr>
+          <w:rFonts w:ascii="Lato" w:cs="Lato" w:eastAsia="Lato" w:hAnsi="Lato"/>
+        </w:rPr>
+        <w:t xml:space="preserve"> </w:t>
+      </w:r>
+    </w:p>
+    <w:p>
+      <w:pPr>
+        <w:spacing w:after="210"/>
+      </w:pPr>
+      <w:r>
+        <w:rPr>
+          <w:rFonts w:ascii="Lato" w:cs="Lato" w:eastAsia="Lato" w:hAnsi="Lato"/>
+        </w:rPr>
+        <w:t xml:space="preserve"/>
+      </w:r>
+    </w:p>
+    <w:p>
+      <w:r>
+        <w:br w:type="page"/>
+      </w:r>
+    </w:p>
+    <w:p>
+      <w:pPr>
+        <w:spacing w:after="0" w:before="120"/>
+      </w:pPr>
+      <w:r>
+        <w:rPr>
+          <w:rFonts w:ascii="Lato" w:cs="Lato" w:eastAsia="Lato" w:hAnsi="Lato"/>
+          <w:b/>
+          <w:bCs/>
+          <w:color w:val="D6A23E"/>
+          <w:spacing w:val="60"/>
+          <w:sz w:val="19"/>
+          <w:szCs w:val="19"/>
+        </w:rPr>
+        <w:t xml:space="preserve">CHAPTER 18</w:t>
       </w:r>
     </w:p>
     <w:p>

</xml_diff>

<commit_message>
book: expand the Five Signals to roughly a page per signal
Each signal now carries a worked example and the common mistake, not
just the definition:

- Lived experience: recency counts, the woman one step ahead is more
  useful than the one ten steps ahead, waiting to feel expert is the
  mistake. Prompt reworded from "ten years ago" to "when I started"
  so it fits a reader at any age.
- Receipts: what counts when you have made no money yet, what does not
  (adjectives, borrowed proof), and how to earn the first one in public
- Recognisable package: the whole spec on one line, plus why the urge
  to redesign arrives around piece four
- Voice: three tests, a second weak/strong pair, and why the strong
  version is always slightly riskier
- Consistency: 104 pieces a year beats 42 and a quiet account, plus a
  recovery rule written before it is needed

Co-Authored-By: Claude Opus 5 <noreply@anthropic.com>
Claude-Session: https://claude.ai/code/session_01TjUUnX46NGL9Rs94eLWYcA
</commit_message>
<xml_diff>
--- a/book/Muslimah-Faceless-Business-Blueprint.docx
+++ b/book/Muslimah-Faceless-Business-Blueprint.docx
@@ -5426,7 +5426,94 @@
           <w:sz w:val="21"/>
           <w:szCs w:val="21"/>
         </w:rPr>
-        <w:t xml:space="preserve">The years standing behind what you say. You are not starting from nothing; you are starting from decades of paying attention. That cannot be faked, bought, or produced quickly.</w:t>
+        <w:t xml:space="preserve">The thing you have actually been through, standing behind what you say. This is the signal people most often think they do not have, and almost always do.</w:t>
+      </w:r>
+    </w:p>
+    <w:p>
+      <w:pPr>
+        <w:spacing w:after="150" w:line="300"/>
+      </w:pPr>
+      <w:r>
+        <w:rPr>
+          <w:rFonts w:ascii="Lato" w:cs="Lato" w:eastAsia="Lato" w:hAnsi="Lato"/>
+          <w:i w:val="false"/>
+          <w:iCs w:val="false"/>
+          <w:color w:val="2B2B2B"/>
+          <w:sz w:val="21"/>
+          <w:szCs w:val="21"/>
+        </w:rPr>
+        <w:t xml:space="preserve">It does not have to be decades. It can be the eighteen months you just spent solving a problem badly and then finally solving it properly. Recency counts for more than people expect — the woman one step ahead of your reader is often more useful to her than the woman ten steps ahead, because she still remembers what the first step felt like.</w:t>
+      </w:r>
+    </w:p>
+    <w:p>
+      <w:pPr>
+        <w:pBdr>
+          <w:left w:val="single" w:color="D6A23E" w:sz="18" w:space="14"/>
+        </w:pBdr>
+        <w:spacing w:after="40" w:before="190"/>
+        <w:ind w:left="230"/>
+      </w:pPr>
+      <w:r>
+        <w:rPr>
+          <w:rFonts w:ascii="Lato" w:cs="Lato" w:eastAsia="Lato" w:hAnsi="Lato"/>
+          <w:b/>
+          <w:bCs/>
+          <w:color w:val="D6A23E"/>
+          <w:spacing w:val="50"/>
+          <w:sz w:val="16"/>
+          <w:szCs w:val="16"/>
+        </w:rPr>
+        <w:t xml:space="preserve">FOR EXAMPLE</w:t>
+      </w:r>
+    </w:p>
+    <w:p>
+      <w:pPr>
+        <w:pBdr>
+          <w:left w:val="single" w:color="D6A23E" w:sz="18" w:space="14"/>
+        </w:pBdr>
+        <w:spacing w:after="200"/>
+        <w:ind w:left="230"/>
+      </w:pPr>
+      <w:r>
+        <w:rPr>
+          <w:rFonts w:ascii="Lato" w:cs="Lato" w:eastAsia="Lato" w:hAnsi="Lato"/>
+          <w:color w:val="2B2B2B"/>
+          <w:sz w:val="20"/>
+          <w:szCs w:val="20"/>
+        </w:rPr>
+        <w:t xml:space="preserve">You spent four Ramadans trying to keep a routine and failing, and in the fifth you worked out what had actually been going wrong. You are not a scholar. You are exactly the right person to tell someone in her first year, because you know the specific way it falls apart.</w:t>
+      </w:r>
+    </w:p>
+    <w:p>
+      <w:pPr>
+        <w:spacing w:after="150" w:line="300"/>
+      </w:pPr>
+      <w:r>
+        <w:rPr>
+          <w:rFonts w:ascii="Lato" w:cs="Lato" w:eastAsia="Lato" w:hAnsi="Lato"/>
+          <w:i w:val="false"/>
+          <w:iCs w:val="false"/>
+          <w:color w:val="2B2B2B"/>
+          <w:sz w:val="21"/>
+          <w:szCs w:val="21"/>
+        </w:rPr>
+        <w:t xml:space="preserve">What it is not: credentials. Nobody buying a $27 guide is checking your qualifications. They are checking whether you sound like you have been where they are.</w:t>
+      </w:r>
+    </w:p>
+    <w:p>
+      <w:pPr>
+        <w:spacing w:after="150" w:line="300"/>
+      </w:pPr>
+      <w:r>
+        <w:rPr>
+          <w:rFonts w:ascii="Lato" w:cs="Lato" w:eastAsia="Lato" w:hAnsi="Lato"/>
+          <w:i w:val="false"/>
+          <w:iCs w:val="false"/>
+          <w:color w:val="2B2B2B"/>
+          <w:sz w:val="21"/>
+          <w:szCs w:val="21"/>
+        </w:rPr>
+        <w:t xml:space="preserve">The mistake here is waiting. Lived experience is not a thing you arrive at; it is a thing you are currently accumulating. If you wait until you feel expert, you will wait past the point where you were most useful.</w:t>
       </w:r>
     </w:p>
     <w:p>
@@ -5487,6 +5574,22 @@
     </w:p>
     <w:p>
       <w:pPr>
+        <w:spacing w:after="150" w:line="300"/>
+      </w:pPr>
+      <w:r>
+        <w:rPr>
+          <w:rFonts w:ascii="Lato" w:cs="Lato" w:eastAsia="Lato" w:hAnsi="Lato"/>
+          <w:i w:val="false"/>
+          <w:iCs w:val="false"/>
+          <w:color w:val="2B2B2B"/>
+          <w:sz w:val="21"/>
+          <w:szCs w:val="21"/>
+        </w:rPr>
+        <w:t xml:space="preserve">The difference between those two lines is not writing skill. It is that the second one could only have been written by someone who did it.</w:t>
+      </w:r>
+    </w:p>
+    <w:p>
+      <w:pPr>
         <w:spacing w:after="40" w:before="260"/>
       </w:pPr>
       <w:r>
@@ -5498,21 +5601,104 @@
           <w:sz w:val="20"/>
           <w:szCs w:val="20"/>
         </w:rPr>
-        <w:t xml:space="preserve">Three things I know now that I did not know ten years ago</w:t>
-      </w:r>
-    </w:p>
-    <w:p>
-      <w:pPr>
-        <w:pBdr>
-          <w:bottom w:val="single" w:color="C9C2B8" w:sz="4" w:space="4"/>
-        </w:pBdr>
-        <w:spacing w:after="0" w:before="170"/>
-      </w:pPr>
-      <w:r>
-        <w:rPr>
-          <w:rFonts w:ascii="Lato" w:cs="Lato" w:eastAsia="Lato" w:hAnsi="Lato"/>
-        </w:rPr>
-        <w:t xml:space="preserve"> </w:t>
+        <w:t xml:space="preserve">Three things I know now that I did not know when I started</w:t>
+      </w:r>
+    </w:p>
+    <w:p>
+      <w:pPr>
+        <w:pBdr>
+          <w:bottom w:val="single" w:color="C9C2B8" w:sz="4" w:space="4"/>
+        </w:pBdr>
+        <w:spacing w:after="0" w:before="170"/>
+      </w:pPr>
+      <w:r>
+        <w:rPr>
+          <w:rFonts w:ascii="Lato" w:cs="Lato" w:eastAsia="Lato" w:hAnsi="Lato"/>
+        </w:rPr>
+        <w:t xml:space="preserve"> </w:t>
+      </w:r>
+    </w:p>
+    <w:p>
+      <w:pPr>
+        <w:pBdr>
+          <w:bottom w:val="single" w:color="C9C2B8" w:sz="4" w:space="4"/>
+        </w:pBdr>
+        <w:spacing w:after="0" w:before="170"/>
+      </w:pPr>
+      <w:r>
+        <w:rPr>
+          <w:rFonts w:ascii="Lato" w:cs="Lato" w:eastAsia="Lato" w:hAnsi="Lato"/>
+        </w:rPr>
+        <w:t xml:space="preserve"> </w:t>
+      </w:r>
+    </w:p>
+    <w:p>
+      <w:pPr>
+        <w:pBdr>
+          <w:bottom w:val="single" w:color="C9C2B8" w:sz="4" w:space="4"/>
+        </w:pBdr>
+        <w:spacing w:after="0" w:before="170"/>
+      </w:pPr>
+      <w:r>
+        <w:rPr>
+          <w:rFonts w:ascii="Lato" w:cs="Lato" w:eastAsia="Lato" w:hAnsi="Lato"/>
+        </w:rPr>
+        <w:t xml:space="preserve"> </w:t>
+      </w:r>
+    </w:p>
+    <w:p>
+      <w:pPr>
+        <w:pBdr>
+          <w:bottom w:val="single" w:color="C9C2B8" w:sz="4" w:space="4"/>
+        </w:pBdr>
+        <w:spacing w:after="0" w:before="170"/>
+      </w:pPr>
+      <w:r>
+        <w:rPr>
+          <w:rFonts w:ascii="Lato" w:cs="Lato" w:eastAsia="Lato" w:hAnsi="Lato"/>
+        </w:rPr>
+        <w:t xml:space="preserve"> </w:t>
+      </w:r>
+    </w:p>
+    <w:p>
+      <w:pPr>
+        <w:pBdr>
+          <w:bottom w:val="single" w:color="C9C2B8" w:sz="4" w:space="4"/>
+        </w:pBdr>
+        <w:spacing w:after="0" w:before="170"/>
+      </w:pPr>
+      <w:r>
+        <w:rPr>
+          <w:rFonts w:ascii="Lato" w:cs="Lato" w:eastAsia="Lato" w:hAnsi="Lato"/>
+        </w:rPr>
+        <w:t xml:space="preserve"> </w:t>
+      </w:r>
+    </w:p>
+    <w:p>
+      <w:pPr>
+        <w:spacing w:after="210"/>
+      </w:pPr>
+      <w:r>
+        <w:rPr>
+          <w:rFonts w:ascii="Lato" w:cs="Lato" w:eastAsia="Lato" w:hAnsi="Lato"/>
+        </w:rPr>
+        <w:t xml:space="preserve"/>
+      </w:r>
+    </w:p>
+    <w:p>
+      <w:pPr>
+        <w:spacing w:after="40" w:before="260"/>
+      </w:pPr>
+      <w:r>
+        <w:rPr>
+          <w:rFonts w:ascii="Lato" w:cs="Lato" w:eastAsia="Lato" w:hAnsi="Lato"/>
+          <w:b/>
+          <w:bCs/>
+          <w:color w:val="102A43"/>
+          <w:sz w:val="20"/>
+          <w:szCs w:val="20"/>
+        </w:rPr>
+        <w:t xml:space="preserve">A problem I have personally solved — badly first, then properly</w:t>
       </w:r>
     </w:p>
     <w:p>
@@ -5610,7 +5796,228 @@
           <w:sz w:val="21"/>
           <w:szCs w:val="21"/>
         </w:rPr>
-        <w:t xml:space="preserve">Showing the work when you cannot show the worker. A receipt does not have to be impressive. It has to be real and it has to be yours. A dated screenshot beats an adjective every time. If you do not have the number, say so and give the one you do have — a reader forgives a small number instantly, and never forgives a vague one.</w:t>
+        <w:t xml:space="preserve">Showing the work when you cannot show the worker. A receipt does not have to be impressive. It has to be real, and it has to be yours.</w:t>
+      </w:r>
+    </w:p>
+    <w:p>
+      <w:pPr>
+        <w:spacing w:after="150" w:line="300"/>
+      </w:pPr>
+      <w:r>
+        <w:rPr>
+          <w:rFonts w:ascii="Lato" w:cs="Lato" w:eastAsia="Lato" w:hAnsi="Lato"/>
+          <w:i w:val="false"/>
+          <w:iCs w:val="false"/>
+          <w:color w:val="2B2B2B"/>
+          <w:sz w:val="21"/>
+          <w:szCs w:val="21"/>
+        </w:rPr>
+        <w:t xml:space="preserve">A dated screenshot beats an adjective every time. If you do not have the number, say so and give the one you do have. A reader forgives a small number instantly. She never forgives a vague one.</w:t>
+      </w:r>
+    </w:p>
+    <w:p>
+      <w:pPr>
+        <w:spacing w:after="150" w:line="300"/>
+      </w:pPr>
+      <w:r>
+        <w:rPr>
+          <w:rFonts w:ascii="Lato" w:cs="Lato" w:eastAsia="Lato" w:hAnsi="Lato"/>
+          <w:i w:val="false"/>
+          <w:iCs w:val="false"/>
+          <w:color w:val="2B2B2B"/>
+          <w:sz w:val="21"/>
+          <w:szCs w:val="21"/>
+        </w:rPr>
+        <w:t xml:space="preserve">What counts as a receipt when you have not made any money yet:</w:t>
+      </w:r>
+    </w:p>
+    <w:p>
+      <w:pPr>
+        <w:pStyle w:val="ListParagraph"/>
+        <w:numPr>
+          <w:ilvl w:val="0"/>
+          <w:numId w:val="2"/>
+        </w:numPr>
+        <w:spacing w:after="90" w:line="290"/>
+      </w:pPr>
+      <w:r>
+        <w:rPr>
+          <w:rFonts w:ascii="Lato" w:cs="Lato" w:eastAsia="Lato" w:hAnsi="Lato"/>
+          <w:color w:val="2B2B2B"/>
+          <w:sz w:val="21"/>
+          <w:szCs w:val="21"/>
+        </w:rPr>
+        <w:t xml:space="preserve">A before and after of your own work — the first version and the current one.</w:t>
+      </w:r>
+    </w:p>
+    <w:p>
+      <w:pPr>
+        <w:pStyle w:val="ListParagraph"/>
+        <w:numPr>
+          <w:ilvl w:val="0"/>
+          <w:numId w:val="2"/>
+        </w:numPr>
+        <w:spacing w:after="90" w:line="290"/>
+      </w:pPr>
+      <w:r>
+        <w:rPr>
+          <w:rFonts w:ascii="Lato" w:cs="Lato" w:eastAsia="Lato" w:hAnsi="Lato"/>
+          <w:color w:val="2B2B2B"/>
+          <w:sz w:val="21"/>
+          <w:szCs w:val="21"/>
+        </w:rPr>
+        <w:t xml:space="preserve">A dated screenshot of anything real. Fourteen subscribers is a receipt. “A growing community” is not.</w:t>
+      </w:r>
+    </w:p>
+    <w:p>
+      <w:pPr>
+        <w:pStyle w:val="ListParagraph"/>
+        <w:numPr>
+          <w:ilvl w:val="0"/>
+          <w:numId w:val="2"/>
+        </w:numPr>
+        <w:spacing w:after="90" w:line="290"/>
+      </w:pPr>
+      <w:r>
+        <w:rPr>
+          <w:rFonts w:ascii="Lato" w:cs="Lato" w:eastAsia="Lato" w:hAnsi="Lato"/>
+          <w:color w:val="2B2B2B"/>
+          <w:sz w:val="21"/>
+          <w:szCs w:val="21"/>
+        </w:rPr>
+        <w:t xml:space="preserve">A message someone sent you, with permission and their name removed.</w:t>
+      </w:r>
+    </w:p>
+    <w:p>
+      <w:pPr>
+        <w:pStyle w:val="ListParagraph"/>
+        <w:numPr>
+          <w:ilvl w:val="0"/>
+          <w:numId w:val="2"/>
+        </w:numPr>
+        <w:spacing w:after="90" w:line="290"/>
+      </w:pPr>
+      <w:r>
+        <w:rPr>
+          <w:rFonts w:ascii="Lato" w:cs="Lato" w:eastAsia="Lato" w:hAnsi="Lato"/>
+          <w:color w:val="2B2B2B"/>
+          <w:sz w:val="21"/>
+          <w:szCs w:val="21"/>
+        </w:rPr>
+        <w:t xml:space="preserve">Your own process, photographed or screen-recorded mid-way through. Unfinished work is evidence that work is happening.</w:t>
+      </w:r>
+    </w:p>
+    <w:p>
+      <w:pPr>
+        <w:pStyle w:val="ListParagraph"/>
+        <w:numPr>
+          <w:ilvl w:val="0"/>
+          <w:numId w:val="2"/>
+        </w:numPr>
+        <w:spacing w:after="90" w:line="290"/>
+      </w:pPr>
+      <w:r>
+        <w:rPr>
+          <w:rFonts w:ascii="Lato" w:cs="Lato" w:eastAsia="Lato" w:hAnsi="Lato"/>
+          <w:color w:val="2B2B2B"/>
+          <w:sz w:val="21"/>
+          <w:szCs w:val="21"/>
+        </w:rPr>
+        <w:t xml:space="preserve">The thing itself. A product that exists is a receipt for the claim that you can make things.</w:t>
+      </w:r>
+    </w:p>
+    <w:p>
+      <w:pPr>
+        <w:spacing w:after="150" w:line="300"/>
+      </w:pPr>
+      <w:r>
+        <w:rPr>
+          <w:rFonts w:ascii="Lato" w:cs="Lato" w:eastAsia="Lato" w:hAnsi="Lato"/>
+          <w:i w:val="false"/>
+          <w:iCs w:val="false"/>
+          <w:color w:val="2B2B2B"/>
+          <w:sz w:val="21"/>
+          <w:szCs w:val="21"/>
+        </w:rPr>
+        <w:t xml:space="preserve">What does not count: adjectives, stock photos of laptops and coffee, and anyone else’s results — including results from the course you bought. Borrowed proof reads as borrowed, and it costs you more than having none.</w:t>
+      </w:r>
+    </w:p>
+    <w:p>
+      <w:pPr>
+        <w:pBdr>
+          <w:left w:val="single" w:color="D6A23E" w:sz="18" w:space="14"/>
+        </w:pBdr>
+        <w:spacing w:after="40" w:before="190"/>
+        <w:ind w:left="230"/>
+      </w:pPr>
+      <w:r>
+        <w:rPr>
+          <w:rFonts w:ascii="Lato" w:cs="Lato" w:eastAsia="Lato" w:hAnsi="Lato"/>
+          <w:b/>
+          <w:bCs/>
+          <w:color w:val="D6A23E"/>
+          <w:spacing w:val="50"/>
+          <w:sz w:val="16"/>
+          <w:szCs w:val="16"/>
+        </w:rPr>
+        <w:t xml:space="preserve">FOR EXAMPLE</w:t>
+      </w:r>
+    </w:p>
+    <w:p>
+      <w:pPr>
+        <w:pBdr>
+          <w:left w:val="single" w:color="D6A23E" w:sz="18" w:space="14"/>
+        </w:pBdr>
+        <w:spacing w:after="200"/>
+        <w:ind w:left="230"/>
+      </w:pPr>
+      <w:r>
+        <w:rPr>
+          <w:rFonts w:ascii="Lato" w:cs="Lato" w:eastAsia="Lato" w:hAnsi="Lato"/>
+          <w:color w:val="2B2B2B"/>
+          <w:sz w:val="20"/>
+          <w:szCs w:val="20"/>
+        </w:rPr>
+        <w:t xml:space="preserve">“I grew fast” is an adjective. “Sixty-one subscribers in seven weeks, and here is the week it stalled” is a receipt — and the stall is the part that makes it believable.</w:t>
+      </w:r>
+    </w:p>
+    <w:p>
+      <w:pPr>
+        <w:pBdr>
+          <w:left w:val="single" w:color="D6A23E" w:sz="18" w:space="14"/>
+        </w:pBdr>
+        <w:spacing w:after="40" w:before="190"/>
+        <w:ind w:left="230"/>
+      </w:pPr>
+      <w:r>
+        <w:rPr>
+          <w:rFonts w:ascii="Lato" w:cs="Lato" w:eastAsia="Lato" w:hAnsi="Lato"/>
+          <w:b/>
+          <w:bCs/>
+          <w:color w:val="D6A23E"/>
+          <w:spacing w:val="50"/>
+          <w:sz w:val="16"/>
+          <w:szCs w:val="16"/>
+        </w:rPr>
+        <w:t xml:space="preserve">BEFORE YOU MOVE ON</w:t>
+      </w:r>
+    </w:p>
+    <w:p>
+      <w:pPr>
+        <w:pBdr>
+          <w:left w:val="single" w:color="D6A23E" w:sz="18" w:space="14"/>
+        </w:pBdr>
+        <w:spacing w:after="200"/>
+        <w:ind w:left="230"/>
+      </w:pPr>
+      <w:r>
+        <w:rPr>
+          <w:rFonts w:ascii="Lato" w:cs="Lato" w:eastAsia="Lato" w:hAnsi="Lato"/>
+          <w:color w:val="2B2B2B"/>
+          <w:sz w:val="20"/>
+          <w:szCs w:val="20"/>
+        </w:rPr>
+        <w:t xml:space="preserve">If you genuinely have no receipts yet, the first one is your own result, earned in public. Start the thing, post the starting number, and post it again in thirty days. That sequence is a receipt even if the number barely moves.</w:t>
       </w:r>
     </w:p>
     <w:p>
@@ -5627,6 +6034,75 @@
           <w:szCs w:val="20"/>
         </w:rPr>
         <w:t xml:space="preserve">One receipt I could screenshot this week</w:t>
+      </w:r>
+    </w:p>
+    <w:p>
+      <w:pPr>
+        <w:pBdr>
+          <w:bottom w:val="single" w:color="C9C2B8" w:sz="4" w:space="4"/>
+        </w:pBdr>
+        <w:spacing w:after="0" w:before="170"/>
+      </w:pPr>
+      <w:r>
+        <w:rPr>
+          <w:rFonts w:ascii="Lato" w:cs="Lato" w:eastAsia="Lato" w:hAnsi="Lato"/>
+        </w:rPr>
+        <w:t xml:space="preserve"> </w:t>
+      </w:r>
+    </w:p>
+    <w:p>
+      <w:pPr>
+        <w:pBdr>
+          <w:bottom w:val="single" w:color="C9C2B8" w:sz="4" w:space="4"/>
+        </w:pBdr>
+        <w:spacing w:after="0" w:before="170"/>
+      </w:pPr>
+      <w:r>
+        <w:rPr>
+          <w:rFonts w:ascii="Lato" w:cs="Lato" w:eastAsia="Lato" w:hAnsi="Lato"/>
+        </w:rPr>
+        <w:t xml:space="preserve"> </w:t>
+      </w:r>
+    </w:p>
+    <w:p>
+      <w:pPr>
+        <w:pBdr>
+          <w:bottom w:val="single" w:color="C9C2B8" w:sz="4" w:space="4"/>
+        </w:pBdr>
+        <w:spacing w:after="0" w:before="170"/>
+      </w:pPr>
+      <w:r>
+        <w:rPr>
+          <w:rFonts w:ascii="Lato" w:cs="Lato" w:eastAsia="Lato" w:hAnsi="Lato"/>
+        </w:rPr>
+        <w:t xml:space="preserve"> </w:t>
+      </w:r>
+    </w:p>
+    <w:p>
+      <w:pPr>
+        <w:spacing w:after="210"/>
+      </w:pPr>
+      <w:r>
+        <w:rPr>
+          <w:rFonts w:ascii="Lato" w:cs="Lato" w:eastAsia="Lato" w:hAnsi="Lato"/>
+        </w:rPr>
+        <w:t xml:space="preserve"/>
+      </w:r>
+    </w:p>
+    <w:p>
+      <w:pPr>
+        <w:spacing w:after="40" w:before="260"/>
+      </w:pPr>
+      <w:r>
+        <w:rPr>
+          <w:rFonts w:ascii="Lato" w:cs="Lato" w:eastAsia="Lato" w:hAnsi="Lato"/>
+          <w:b/>
+          <w:bCs/>
+          <w:color w:val="102A43"/>
+          <w:sz w:val="20"/>
+          <w:szCs w:val="20"/>
+        </w:rPr>
+        <w:t xml:space="preserve">The number I am starting from today — whatever it is</w:t>
       </w:r>
     </w:p>
     <w:p>
@@ -5710,7 +6186,7 @@
           <w:sz w:val="21"/>
           <w:szCs w:val="21"/>
         </w:rPr>
-        <w:t xml:space="preserve">Looking the same for long enough that people learn you. Two fonts. Three or four colours. One layout you repeat. Not because it is beautiful — because repetition does, for free, the job a face would have done.</w:t>
+        <w:t xml:space="preserve">Looking the same for long enough that people learn you. Not because it is beautiful — because repetition does, for free, the job a face would have done.</w:t>
       </w:r>
     </w:p>
     <w:p>
@@ -5726,7 +6202,101 @@
           <w:sz w:val="21"/>
           <w:szCs w:val="21"/>
         </w:rPr>
-        <w:t xml:space="preserve">Pick today. Use it for ten pieces without changing anything. You are allowed to redesign after ten, not before.</w:t>
+        <w:t xml:space="preserve">The whole specification fits on a line: two fonts, three or four colours, one layout you repeat, and one format people come to expect from you.</w:t>
+      </w:r>
+    </w:p>
+    <w:p>
+      <w:pPr>
+        <w:pBdr>
+          <w:left w:val="single" w:color="D6A23E" w:sz="18" w:space="14"/>
+        </w:pBdr>
+        <w:spacing w:after="40" w:before="190"/>
+        <w:ind w:left="230"/>
+      </w:pPr>
+      <w:r>
+        <w:rPr>
+          <w:rFonts w:ascii="Lato" w:cs="Lato" w:eastAsia="Lato" w:hAnsi="Lato"/>
+          <w:b/>
+          <w:bCs/>
+          <w:color w:val="D6A23E"/>
+          <w:spacing w:val="50"/>
+          <w:sz w:val="16"/>
+          <w:szCs w:val="16"/>
+        </w:rPr>
+        <w:t xml:space="preserve">FOR EXAMPLE</w:t>
+      </w:r>
+    </w:p>
+    <w:p>
+      <w:pPr>
+        <w:pBdr>
+          <w:left w:val="single" w:color="D6A23E" w:sz="18" w:space="14"/>
+        </w:pBdr>
+        <w:spacing w:after="200"/>
+        <w:ind w:left="230"/>
+      </w:pPr>
+      <w:r>
+        <w:rPr>
+          <w:rFonts w:ascii="Lato" w:cs="Lato" w:eastAsia="Lato" w:hAnsi="Lato"/>
+          <w:color w:val="2B2B2B"/>
+          <w:sz w:val="20"/>
+          <w:szCs w:val="20"/>
+        </w:rPr>
+        <w:t xml:space="preserve">Someone scrolling sees a navy square with a line of serif text across the middle. She does not read the handle. She already knows it is you, because it is the ninth time this month she has seen that square. That recognition is the entire mechanism, and it is doing what a photograph of your face would have done.</w:t>
+      </w:r>
+    </w:p>
+    <w:p>
+      <w:pPr>
+        <w:spacing w:after="150" w:line="300"/>
+      </w:pPr>
+      <w:r>
+        <w:rPr>
+          <w:rFonts w:ascii="Lato" w:cs="Lato" w:eastAsia="Lato" w:hAnsi="Lato"/>
+          <w:i w:val="false"/>
+          <w:iCs w:val="false"/>
+          <w:color w:val="2B2B2B"/>
+          <w:sz w:val="21"/>
+          <w:szCs w:val="21"/>
+        </w:rPr>
+        <w:t xml:space="preserve">The mistake is redesigning. It feels productive, it is genuinely enjoyable, and it resets the counter to zero every time. The recognition only starts once you stop changing things.</w:t>
+      </w:r>
+    </w:p>
+    <w:p>
+      <w:pPr>
+        <w:pBdr>
+          <w:left w:val="single" w:color="D6A23E" w:sz="18" w:space="14"/>
+        </w:pBdr>
+        <w:spacing w:after="40" w:before="190"/>
+        <w:ind w:left="230"/>
+      </w:pPr>
+      <w:r>
+        <w:rPr>
+          <w:rFonts w:ascii="Lato" w:cs="Lato" w:eastAsia="Lato" w:hAnsi="Lato"/>
+          <w:b/>
+          <w:bCs/>
+          <w:color w:val="D6A23E"/>
+          <w:spacing w:val="50"/>
+          <w:sz w:val="16"/>
+          <w:szCs w:val="16"/>
+        </w:rPr>
+        <w:t xml:space="preserve">BEFORE YOU MOVE ON</w:t>
+      </w:r>
+    </w:p>
+    <w:p>
+      <w:pPr>
+        <w:pBdr>
+          <w:left w:val="single" w:color="D6A23E" w:sz="18" w:space="14"/>
+        </w:pBdr>
+        <w:spacing w:after="200"/>
+        <w:ind w:left="230"/>
+      </w:pPr>
+      <w:r>
+        <w:rPr>
+          <w:rFonts w:ascii="Lato" w:cs="Lato" w:eastAsia="Lato" w:hAnsi="Lato"/>
+          <w:color w:val="2B2B2B"/>
+          <w:sz w:val="20"/>
+          <w:szCs w:val="20"/>
+        </w:rPr>
+        <w:t xml:space="preserve">Pick today, then use it for ten pieces without changing anything. You are allowed to revisit it after ten, not before. Write the date on the line below so the decision is already made when the urge arrives — and it will arrive around piece four.</w:t>
       </w:r>
     </w:p>
     <w:p>
@@ -5854,7 +6424,7 @@
           <w:sz w:val="21"/>
           <w:szCs w:val="21"/>
         </w:rPr>
-        <w:t xml:space="preserve">Sounding like one specific human being. Faceless is not voiceless. You can keep your face out of it entirely and still be completely present.</w:t>
+        <w:t xml:space="preserve">Sounding like one specific human being. Faceless is not voiceless — you can keep your face out of it entirely and still be completely present.</w:t>
       </w:r>
     </w:p>
     <w:p>
@@ -5870,7 +6440,80 @@
           <w:sz w:val="21"/>
           <w:szCs w:val="21"/>
         </w:rPr>
-        <w:t xml:space="preserve">On AI, plainly: use it for the parts that carry no judgement — sorting, tidying, giving you twenty options to react to. The moment it starts supplying what you think, you have handed over the only part that was working.</w:t>
+        <w:t xml:space="preserve">Voice is mostly a matter of removal. Most people write a perfectly good sentence, then add a layer of business language on top of it because they think that is what selling sounds like. It is not. It is what nervousness sounds like.</w:t>
+      </w:r>
+    </w:p>
+    <w:p>
+      <w:pPr>
+        <w:spacing w:after="150" w:line="300"/>
+      </w:pPr>
+      <w:r>
+        <w:rPr>
+          <w:rFonts w:ascii="Lato" w:cs="Lato" w:eastAsia="Lato" w:hAnsi="Lato"/>
+          <w:i w:val="false"/>
+          <w:iCs w:val="false"/>
+          <w:color w:val="2B2B2B"/>
+          <w:sz w:val="21"/>
+          <w:szCs w:val="21"/>
+        </w:rPr>
+        <w:t xml:space="preserve">Three tests, applied to any line you are unsure about:</w:t>
+      </w:r>
+    </w:p>
+    <w:p>
+      <w:pPr>
+        <w:pStyle w:val="ListParagraph"/>
+        <w:numPr>
+          <w:ilvl w:val="0"/>
+          <w:numId w:val="2"/>
+        </w:numPr>
+        <w:spacing w:after="90" w:line="290"/>
+      </w:pPr>
+      <w:r>
+        <w:rPr>
+          <w:rFonts w:ascii="Lato" w:cs="Lato" w:eastAsia="Lato" w:hAnsi="Lato"/>
+          <w:color w:val="2B2B2B"/>
+          <w:sz w:val="21"/>
+          <w:szCs w:val="21"/>
+        </w:rPr>
+        <w:t xml:space="preserve">Would I say this out loud, to a friend, in this order?</w:t>
+      </w:r>
+    </w:p>
+    <w:p>
+      <w:pPr>
+        <w:pStyle w:val="ListParagraph"/>
+        <w:numPr>
+          <w:ilvl w:val="0"/>
+          <w:numId w:val="2"/>
+        </w:numPr>
+        <w:spacing w:after="90" w:line="290"/>
+      </w:pPr>
+      <w:r>
+        <w:rPr>
+          <w:rFonts w:ascii="Lato" w:cs="Lato" w:eastAsia="Lato" w:hAnsi="Lato"/>
+          <w:color w:val="2B2B2B"/>
+          <w:sz w:val="21"/>
+          <w:szCs w:val="21"/>
+        </w:rPr>
+        <w:t xml:space="preserve">Is there a word in here I have never used in my life?</w:t>
+      </w:r>
+    </w:p>
+    <w:p>
+      <w:pPr>
+        <w:pStyle w:val="ListParagraph"/>
+        <w:numPr>
+          <w:ilvl w:val="0"/>
+          <w:numId w:val="2"/>
+        </w:numPr>
+        <w:spacing w:after="90" w:line="290"/>
+      </w:pPr>
+      <w:r>
+        <w:rPr>
+          <w:rFonts w:ascii="Lato" w:cs="Lato" w:eastAsia="Lato" w:hAnsi="Lato"/>
+          <w:color w:val="2B2B2B"/>
+          <w:sz w:val="21"/>
+          <w:szCs w:val="21"/>
+        </w:rPr>
+        <w:t xml:space="preserve">Does it name something specific, or is it true of everybody?</w:t>
       </w:r>
     </w:p>
     <w:p>
@@ -5927,6 +6570,94 @@
           <w:szCs w:val="20"/>
         </w:rPr>
         <w:t xml:space="preserve">I skipped two weeks in Ramadan and nothing bad happened.</w:t>
+      </w:r>
+    </w:p>
+    <w:p>
+      <w:pPr>
+        <w:spacing w:after="50" w:before="60"/>
+        <w:ind w:left="260"/>
+      </w:pPr>
+      <w:r>
+        <w:rPr>
+          <w:rFonts w:ascii="Lato" w:cs="Lato" w:eastAsia="Lato" w:hAnsi="Lato"/>
+          <w:b/>
+          <w:bCs/>
+          <w:color w:val="6B6B6B"/>
+          <w:sz w:val="20"/>
+          <w:szCs w:val="20"/>
+        </w:rPr>
+        <w:t xml:space="preserve">Weak.  </w:t>
+      </w:r>
+      <w:r>
+        <w:rPr>
+          <w:rFonts w:ascii="Lato" w:cs="Lato" w:eastAsia="Lato" w:hAnsi="Lato"/>
+          <w:i/>
+          <w:iCs/>
+          <w:color w:val="6B6B6B"/>
+          <w:sz w:val="20"/>
+          <w:szCs w:val="20"/>
+        </w:rPr>
+        <w:t xml:space="preserve">Unlock your full potential and start your journey today.</w:t>
+      </w:r>
+    </w:p>
+    <w:p>
+      <w:pPr>
+        <w:spacing w:after="170"/>
+        <w:ind w:left="260"/>
+      </w:pPr>
+      <w:r>
+        <w:rPr>
+          <w:rFonts w:ascii="Lato" w:cs="Lato" w:eastAsia="Lato" w:hAnsi="Lato"/>
+          <w:b/>
+          <w:bCs/>
+          <w:color w:val="102A43"/>
+          <w:sz w:val="20"/>
+          <w:szCs w:val="20"/>
+        </w:rPr>
+        <w:t xml:space="preserve">Strong.  </w:t>
+      </w:r>
+      <w:r>
+        <w:rPr>
+          <w:rFonts w:ascii="Lato" w:cs="Lato" w:eastAsia="Lato" w:hAnsi="Lato"/>
+          <w:i/>
+          <w:iCs/>
+          <w:color w:val="2B2B2B"/>
+          <w:sz w:val="20"/>
+          <w:szCs w:val="20"/>
+        </w:rPr>
+        <w:t xml:space="preserve">You do not need another course. You need to finish the one you bought in March.</w:t>
+      </w:r>
+    </w:p>
+    <w:p>
+      <w:pPr>
+        <w:spacing w:after="150" w:line="300"/>
+      </w:pPr>
+      <w:r>
+        <w:rPr>
+          <w:rFonts w:ascii="Lato" w:cs="Lato" w:eastAsia="Lato" w:hAnsi="Lato"/>
+          <w:i w:val="false"/>
+          <w:iCs w:val="false"/>
+          <w:color w:val="2B2B2B"/>
+          <w:sz w:val="21"/>
+          <w:szCs w:val="21"/>
+        </w:rPr>
+        <w:t xml:space="preserve">Notice that the strong version in both is shorter, more specific, and slightly riskier. That last part is not incidental. A line that could not possibly offend anyone generally does not reach anyone either.</w:t>
+      </w:r>
+    </w:p>
+    <w:p>
+      <w:pPr>
+        <w:spacing w:after="150" w:line="300"/>
+      </w:pPr>
+      <w:r>
+        <w:rPr>
+          <w:rFonts w:ascii="Lato" w:cs="Lato" w:eastAsia="Lato" w:hAnsi="Lato"/>
+          <w:i w:val="false"/>
+          <w:iCs w:val="false"/>
+          <w:color w:val="2B2B2B"/>
+          <w:sz w:val="21"/>
+          <w:szCs w:val="21"/>
+        </w:rPr>
+        <w:t xml:space="preserve">On AI, plainly: use it for the parts that carry no judgement — sorting, tidying, giving you twenty options to react to. The moment it starts supplying what you think, you have handed over the only part that was working.</w:t>
       </w:r>
     </w:p>
     <w:p>
@@ -6040,7 +6771,7 @@
           <w:sz w:val="21"/>
           <w:szCs w:val="21"/>
         </w:rPr>
-        <w:t xml:space="preserve">A number you can keep in a bad week. Not a schedule somebody else designed for a life that is not yours. Pick the number you could keep on your worst week, not your best one. Everyone picks their best-week number, then misses it, and the missing is what makes people quit.</w:t>
+        <w:t xml:space="preserve">A number you can keep in a bad week. Not a schedule somebody else designed for a life that is not yours.</w:t>
       </w:r>
     </w:p>
     <w:p>
@@ -6056,7 +6787,78 @@
           <w:sz w:val="21"/>
           <w:szCs w:val="21"/>
         </w:rPr>
-        <w:t xml:space="preserve">You will miss it. Someone will get sick. Work will go sideways. When it happens, do not spend a week feeling bad about it. Open the plan and start again on the next one.</w:t>
+        <w:t xml:space="preserve">Pick the number you could keep on your worst week, not your best one. Everybody picks their best-week number. Then they miss it, and the missing is what makes people quit — not the workload.</w:t>
+      </w:r>
+    </w:p>
+    <w:p>
+      <w:pPr>
+        <w:pBdr>
+          <w:left w:val="single" w:color="D6A23E" w:sz="18" w:space="14"/>
+        </w:pBdr>
+        <w:spacing w:after="40" w:before="190"/>
+        <w:ind w:left="230"/>
+      </w:pPr>
+      <w:r>
+        <w:rPr>
+          <w:rFonts w:ascii="Lato" w:cs="Lato" w:eastAsia="Lato" w:hAnsi="Lato"/>
+          <w:b/>
+          <w:bCs/>
+          <w:color w:val="D6A23E"/>
+          <w:spacing w:val="50"/>
+          <w:sz w:val="16"/>
+          <w:szCs w:val="16"/>
+        </w:rPr>
+        <w:t xml:space="preserve">FOR EXAMPLE</w:t>
+      </w:r>
+    </w:p>
+    <w:p>
+      <w:pPr>
+        <w:pBdr>
+          <w:left w:val="single" w:color="D6A23E" w:sz="18" w:space="14"/>
+        </w:pBdr>
+        <w:spacing w:after="200"/>
+        <w:ind w:left="230"/>
+      </w:pPr>
+      <w:r>
+        <w:rPr>
+          <w:rFonts w:ascii="Lato" w:cs="Lato" w:eastAsia="Lato" w:hAnsi="Lato"/>
+          <w:color w:val="2B2B2B"/>
+          <w:sz w:val="20"/>
+          <w:szCs w:val="20"/>
+        </w:rPr>
+        <w:t xml:space="preserve">Two posts a week, held for a year, is a hundred and four pieces and an audience that knows when to expect you. Daily posting for six weeks is forty-two pieces and a quiet account by August. The second one felt far more serious at the time.</w:t>
+      </w:r>
+    </w:p>
+    <w:p>
+      <w:pPr>
+        <w:spacing w:after="150" w:line="300"/>
+      </w:pPr>
+      <w:r>
+        <w:rPr>
+          <w:rFonts w:ascii="Lato" w:cs="Lato" w:eastAsia="Lato" w:hAnsi="Lato"/>
+          <w:i w:val="false"/>
+          <w:iCs w:val="false"/>
+          <w:color w:val="2B2B2B"/>
+          <w:sz w:val="21"/>
+          <w:szCs w:val="21"/>
+        </w:rPr>
+        <w:t xml:space="preserve">You will miss it. Someone will get sick, work will go sideways, or Ramadan will arrive and reorganise everything. That is not a failure of the plan; it is a fact the plan has to survive.</w:t>
+      </w:r>
+    </w:p>
+    <w:p>
+      <w:pPr>
+        <w:spacing w:after="150" w:line="300"/>
+      </w:pPr>
+      <w:r>
+        <w:rPr>
+          <w:rFonts w:ascii="Lato" w:cs="Lato" w:eastAsia="Lato" w:hAnsi="Lato"/>
+          <w:i w:val="false"/>
+          <w:iCs w:val="false"/>
+          <w:color w:val="2B2B2B"/>
+          <w:sz w:val="21"/>
+          <w:szCs w:val="21"/>
+        </w:rPr>
+        <w:t xml:space="preserve">So decide the recovery rule now, while nothing has gone wrong: when you miss, you do not spend a week feeling bad about it and you do not start over. You open the plan and start again on the next one. Missing costs you one unit. Guilt costs you a month.</w:t>
       </w:r>
     </w:p>
     <w:p>
@@ -6087,6 +6889,75 @@
           <w:rFonts w:ascii="Lato" w:cs="Lato" w:eastAsia="Lato" w:hAnsi="Lato"/>
         </w:rPr>
         <w:t xml:space="preserve"> </w:t>
+      </w:r>
+    </w:p>
+    <w:p>
+      <w:pPr>
+        <w:pBdr>
+          <w:bottom w:val="single" w:color="C9C2B8" w:sz="4" w:space="4"/>
+        </w:pBdr>
+        <w:spacing w:after="0" w:before="170"/>
+      </w:pPr>
+      <w:r>
+        <w:rPr>
+          <w:rFonts w:ascii="Lato" w:cs="Lato" w:eastAsia="Lato" w:hAnsi="Lato"/>
+        </w:rPr>
+        <w:t xml:space="preserve"> </w:t>
+      </w:r>
+    </w:p>
+    <w:p>
+      <w:pPr>
+        <w:pBdr>
+          <w:bottom w:val="single" w:color="C9C2B8" w:sz="4" w:space="4"/>
+        </w:pBdr>
+        <w:spacing w:after="0" w:before="170"/>
+      </w:pPr>
+      <w:r>
+        <w:rPr>
+          <w:rFonts w:ascii="Lato" w:cs="Lato" w:eastAsia="Lato" w:hAnsi="Lato"/>
+        </w:rPr>
+        <w:t xml:space="preserve"> </w:t>
+      </w:r>
+    </w:p>
+    <w:p>
+      <w:pPr>
+        <w:pBdr>
+          <w:bottom w:val="single" w:color="C9C2B8" w:sz="4" w:space="4"/>
+        </w:pBdr>
+        <w:spacing w:after="0" w:before="170"/>
+      </w:pPr>
+      <w:r>
+        <w:rPr>
+          <w:rFonts w:ascii="Lato" w:cs="Lato" w:eastAsia="Lato" w:hAnsi="Lato"/>
+        </w:rPr>
+        <w:t xml:space="preserve"> </w:t>
+      </w:r>
+    </w:p>
+    <w:p>
+      <w:pPr>
+        <w:spacing w:after="210"/>
+      </w:pPr>
+      <w:r>
+        <w:rPr>
+          <w:rFonts w:ascii="Lato" w:cs="Lato" w:eastAsia="Lato" w:hAnsi="Lato"/>
+        </w:rPr>
+        <w:t xml:space="preserve"/>
+      </w:r>
+    </w:p>
+    <w:p>
+      <w:pPr>
+        <w:spacing w:after="40" w:before="260"/>
+      </w:pPr>
+      <w:r>
+        <w:rPr>
+          <w:rFonts w:ascii="Lato" w:cs="Lato" w:eastAsia="Lato" w:hAnsi="Lato"/>
+          <w:b/>
+          <w:bCs/>
+          <w:color w:val="102A43"/>
+          <w:sz w:val="20"/>
+          <w:szCs w:val="20"/>
+        </w:rPr>
+        <w:t xml:space="preserve">My recovery rule, written before I need it</w:t>
       </w:r>
     </w:p>
     <w:p>

</xml_diff>

<commit_message>
book: spell out buy now, pay later in the halal chapter
The acronym appeared unexplained in the fill-in prompt. Name the
providers, explain the mechanics, and say why it matters: platforms
enable it by default, so a seller can be offering financing she never
chose, and some providers charge late fees or run interest-bearing
plans alongside the four-payment option.

Co-Authored-By: Claude Opus 5 <noreply@anthropic.com>
Claude-Session: https://claude.ai/code/session_01TjUUnX46NGL9Rs94eLWYcA
</commit_message>
<xml_diff>
--- a/book/Muslimah-Faceless-Business-Blueprint.docx
+++ b/book/Muslimah-Faceless-Business-Blueprint.docx
@@ -8043,7 +8043,7 @@
           <w:sz w:val="21"/>
           <w:szCs w:val="21"/>
         </w:rPr>
-        <w:t xml:space="preserve">Buy-now-pay-later at checkout. Many platforms enable these automatically. Check what is switched on, and read how the provider makes its money.</w:t>
+        <w:t xml:space="preserve">Buy now, pay later at checkout — Klarna, Afterpay, Affirm, Sezzle, PayPal Pay in 4 and the rest. The customer takes the product now and pays in instalments; you are paid in full, minus a fee. Most checkout platforms switch at least one of these on by default, so you can be offering financing you never chose. Check what is enabled in your own shop, and read how that provider actually makes its money — several charge the customer late fees, and some run longer interest-bearing plans alongside the four-payment option.</w:t>
       </w:r>
     </w:p>
     <w:p>
@@ -8155,7 +8155,7 @@
           <w:sz w:val="20"/>
           <w:szCs w:val="20"/>
         </w:rPr>
-        <w:t xml:space="preserve">My standard on payment plans, BNPL and the account I bank into</w:t>
+        <w:t xml:space="preserve">My standard on payment plans, on buy-now-pay-later at my checkout, and on the account my business money sits in</w:t>
       </w:r>
     </w:p>
     <w:p>

</xml_diff>